<commit_message>
Finished GE01 and Updated Tech Doc for Module 1. Completed TestLibrary
</commit_message>
<xml_diff>
--- a/Guided Explorations/GE M01 Object Oriented Programming Fundamentals and  Environment .docx
+++ b/Guided Explorations/GE M01 Object Oriented Programming Fundamentals and  Environment .docx
@@ -1038,7 +1038,21 @@
                   <w:color w:val="1155CC"/>
                   <w:u w:val="single"/>
                 </w:rPr>
-                <w:t>Bluesky CEO Jay Graber warns: If you're a student, using AI means</w:t>
+                <w:t>Bluesky CEO Jay Graber warns: If you're a st</w:t>
+              </w:r>
+              <w:r>
+                <w:rPr>
+                  <w:color w:val="1155CC"/>
+                  <w:u w:val="single"/>
+                </w:rPr>
+                <w:t>u</w:t>
+              </w:r>
+              <w:r>
+                <w:rPr>
+                  <w:color w:val="1155CC"/>
+                  <w:u w:val="single"/>
+                </w:rPr>
+                <w:t>dent, using AI means</w:t>
               </w:r>
             </w:hyperlink>
             <w:r>
@@ -1056,6 +1070,19 @@
             </w:pPr>
             <w:r>
               <w:t>What skills do you risk losing if you depend on AI too early?</w:t>
+            </w:r>
+          </w:p>
+          <w:p>
+            <w:pPr>
+              <w:ind w:left="0"/>
+            </w:pPr>
+          </w:p>
+          <w:p>
+            <w:pPr>
+              <w:ind w:left="0"/>
+            </w:pPr>
+            <w:r>
+              <w:t>You risk losing critical thinking, the ability to solve problems independently, and developing your own unique voice and understanding.</w:t>
             </w:r>
           </w:p>
           <w:p>
@@ -1083,6 +1110,7 @@
               <w:ind w:left="0"/>
             </w:pPr>
             <w:r>
+              <w:lastRenderedPageBreak/>
               <w:t>2.</w:t>
             </w:r>
             <w:hyperlink r:id="rId12">
@@ -1091,7 +1119,21 @@
                   <w:color w:val="1155CC"/>
                   <w:u w:val="single"/>
                 </w:rPr>
-                <w:t xml:space="preserve"> Navigating the AI Era: Self-Regulation</w:t>
+                <w:t xml:space="preserve"> Navigating the AI Era: Self-Regulat</w:t>
+              </w:r>
+              <w:r>
+                <w:rPr>
+                  <w:color w:val="1155CC"/>
+                  <w:u w:val="single"/>
+                </w:rPr>
+                <w:t>i</w:t>
+              </w:r>
+              <w:r>
+                <w:rPr>
+                  <w:color w:val="1155CC"/>
+                  <w:u w:val="single"/>
+                </w:rPr>
+                <w:t>on</w:t>
               </w:r>
             </w:hyperlink>
             <w:r>
@@ -1139,6 +1181,21 @@
             </w:pPr>
             <w:r>
               <w:t>What does self-regulation look like when using AI for assignments?</w:t>
+            </w:r>
+          </w:p>
+          <w:p>
+            <w:pPr>
+              <w:spacing w:line="240" w:lineRule="auto"/>
+              <w:ind w:left="0"/>
+            </w:pPr>
+          </w:p>
+          <w:p>
+            <w:pPr>
+              <w:spacing w:line="240" w:lineRule="auto"/>
+              <w:ind w:left="0"/>
+            </w:pPr>
+            <w:r>
+              <w:t>Using prompts that inspire real learning instead of producing an answer, setting boundaries for when and where you use LMs, and continue to collaborate with real people</w:t>
             </w:r>
           </w:p>
           <w:p>
@@ -1167,7 +1224,6 @@
               <w:ind w:left="0"/>
             </w:pPr>
             <w:r>
-              <w:lastRenderedPageBreak/>
               <w:t xml:space="preserve">3 Summarize 3 Strategies you will use this semester to build skills, become a lifelong learner, and </w:t>
             </w:r>
             <w:hyperlink r:id="rId13" w:anchor="heading=h.awn48q1b3kpz">
@@ -1183,6 +1239,19 @@
             </w:hyperlink>
             <w:r>
               <w:t xml:space="preserve"> in a way that supports your own thinking.</w:t>
+            </w:r>
+          </w:p>
+          <w:p>
+            <w:pPr>
+              <w:ind w:left="0"/>
+            </w:pPr>
+          </w:p>
+          <w:p>
+            <w:pPr>
+              <w:ind w:left="0"/>
+            </w:pPr>
+            <w:r>
+              <w:t>I plan to continue building programs that excite me, help my peers in my group with understanding key concepts and exploring code, and setting aside time this semester to really dive into tech doc / README writing skills</w:t>
             </w:r>
           </w:p>
           <w:p>
@@ -1534,6 +1603,7 @@
                   <w:ind w:firstLine="360"/>
                 </w:pPr>
                 <w:r>
+                  <w:lastRenderedPageBreak/>
                   <w:t>Include your own drawings such as for memory, arrays, etc.</w:t>
                 </w:r>
               </w:p>
@@ -1607,6 +1677,7 @@
                   <w:rPr>
                     <w:shd w:val="clear" w:color="auto" w:fill="D9EAD3"/>
                   </w:rPr>
+                  <w:lastRenderedPageBreak/>
                   <w:t>DO Include Resources that give steps or help explain concepts</w:t>
                 </w:r>
               </w:p>
@@ -1722,7 +1793,6 @@
           <w:b/>
           <w:bCs/>
         </w:rPr>
-        <w:lastRenderedPageBreak/>
         <w:t>Analyze and Apply principles of computing to identify solutions</w:t>
       </w:r>
     </w:p>
@@ -2016,6 +2086,11 @@
       </w:pPr>
       <w:bookmarkStart w:id="5" w:name="_heading=h.qa3dtmgnnltf" w:colFirst="0" w:colLast="0"/>
       <w:bookmarkEnd w:id="5"/>
+    </w:p>
+    <w:p>
+      <w:pPr>
+        <w:pStyle w:val="Heading1"/>
+      </w:pPr>
       <w:r>
         <w:t>Part 2 Analyze and Apply</w:t>
       </w:r>
@@ -2246,11 +2321,96 @@
     </w:p>
     <w:p>
       <w:pPr>
+        <w:rPr>
+          <w:shd w:val="clear" w:color="auto" w:fill="FFF2CC"/>
+        </w:rPr>
+      </w:pPr>
+    </w:p>
+    <w:p>
+      <w:pPr>
+        <w:rPr>
+          <w:shd w:val="clear" w:color="auto" w:fill="FFF2CC"/>
+        </w:rPr>
+      </w:pPr>
+    </w:p>
+    <w:p>
+      <w:pPr>
+        <w:rPr>
+          <w:shd w:val="clear" w:color="auto" w:fill="FFF2CC"/>
+        </w:rPr>
+      </w:pPr>
+    </w:p>
+    <w:p>
+      <w:pPr>
+        <w:rPr>
+          <w:shd w:val="clear" w:color="auto" w:fill="FFF2CC"/>
+        </w:rPr>
+      </w:pPr>
+    </w:p>
+    <w:p>
+      <w:pPr>
+        <w:rPr>
+          <w:shd w:val="clear" w:color="auto" w:fill="FFF2CC"/>
+        </w:rPr>
+      </w:pPr>
+    </w:p>
+    <w:p>
+      <w:pPr>
+        <w:rPr>
+          <w:shd w:val="clear" w:color="auto" w:fill="FFF2CC"/>
+        </w:rPr>
+      </w:pPr>
+    </w:p>
+    <w:p>
+      <w:pPr>
+        <w:rPr>
+          <w:shd w:val="clear" w:color="auto" w:fill="FFF2CC"/>
+        </w:rPr>
+      </w:pPr>
+    </w:p>
+    <w:p>
+      <w:pPr>
+        <w:rPr>
+          <w:shd w:val="clear" w:color="auto" w:fill="FFF2CC"/>
+        </w:rPr>
+      </w:pPr>
+    </w:p>
+    <w:p>
+      <w:pPr>
+        <w:rPr>
+          <w:shd w:val="clear" w:color="auto" w:fill="FFF2CC"/>
+        </w:rPr>
+      </w:pPr>
+    </w:p>
+    <w:p>
+      <w:pPr>
+        <w:rPr>
+          <w:shd w:val="clear" w:color="auto" w:fill="FFF2CC"/>
+        </w:rPr>
+      </w:pPr>
+    </w:p>
+    <w:p>
+      <w:pPr>
+        <w:rPr>
+          <w:shd w:val="clear" w:color="auto" w:fill="FFF2CC"/>
+        </w:rPr>
+      </w:pPr>
+    </w:p>
+    <w:p>
+      <w:pPr>
+        <w:rPr>
+          <w:shd w:val="clear" w:color="auto" w:fill="FFF2CC"/>
+        </w:rPr>
+      </w:pPr>
+    </w:p>
+    <w:p>
+      <w:pPr>
         <w:pStyle w:val="Heading2"/>
       </w:pPr>
       <w:bookmarkStart w:id="6" w:name="_heading=h.tli1oaximfqo" w:colFirst="0" w:colLast="0"/>
       <w:bookmarkEnd w:id="6"/>
       <w:r>
+        <w:lastRenderedPageBreak/>
         <w:t xml:space="preserve">Method </w:t>
       </w:r>
       <w:proofErr w:type="spellStart"/>
@@ -2972,6 +3132,9 @@
       <w:r>
         <w:t>User Story:</w:t>
       </w:r>
+      <w:r>
+        <w:t xml:space="preserve">  As a library member, I want to see what books are available</w:t>
+      </w:r>
     </w:p>
     <w:p>
       <w:r>
@@ -2994,6 +3157,12 @@
         </w:rPr>
         <w:t xml:space="preserve"> </w:t>
       </w:r>
+      <w:r>
+        <w:rPr>
+          <w:shd w:val="clear" w:color="auto" w:fill="FFF2CC"/>
+        </w:rPr>
+        <w:t>Outputs each book’s location, title, author, and year</w:t>
+      </w:r>
     </w:p>
     <w:p>
       <w:pPr>
@@ -3011,10 +3180,60 @@
         </w:rPr>
         <w:t xml:space="preserve"> </w:t>
       </w:r>
-    </w:p>
-    <w:p>
-      <w:r>
-        <w:t xml:space="preserve"> Fill in table</w:t>
+      <w:r>
+        <w:rPr>
+          <w:shd w:val="clear" w:color="auto" w:fill="FFF2CC"/>
+        </w:rPr>
+        <w:t>Does not output empty spaces</w:t>
+      </w:r>
+    </w:p>
+    <w:p>
+      <w:r>
+        <w:t xml:space="preserve"> </w:t>
+      </w:r>
+    </w:p>
+    <w:p>
+      <w:pPr>
+        <w:ind w:left="0" w:firstLine="720"/>
+      </w:pPr>
+    </w:p>
+    <w:p>
+      <w:pPr>
+        <w:ind w:left="0" w:firstLine="720"/>
+      </w:pPr>
+    </w:p>
+    <w:p>
+      <w:pPr>
+        <w:ind w:left="0" w:firstLine="720"/>
+      </w:pPr>
+    </w:p>
+    <w:p>
+      <w:pPr>
+        <w:ind w:left="0" w:firstLine="720"/>
+      </w:pPr>
+    </w:p>
+    <w:p>
+      <w:pPr>
+        <w:ind w:left="0" w:firstLine="720"/>
+      </w:pPr>
+    </w:p>
+    <w:p>
+      <w:pPr>
+        <w:ind w:left="0" w:firstLine="720"/>
+      </w:pPr>
+    </w:p>
+    <w:p>
+      <w:pPr>
+        <w:ind w:left="0" w:firstLine="720"/>
+      </w:pPr>
+    </w:p>
+    <w:p>
+      <w:pPr>
+        <w:ind w:left="0" w:firstLine="720"/>
+      </w:pPr>
+      <w:r>
+        <w:lastRenderedPageBreak/>
+        <w:t>Fill in table</w:t>
       </w:r>
     </w:p>
     <w:p/>
@@ -3035,10 +3254,10 @@
         <w:tblLook w:val="0600" w:firstRow="0" w:lastRow="0" w:firstColumn="0" w:lastColumn="0" w:noHBand="1" w:noVBand="1"/>
       </w:tblPr>
       <w:tblGrid>
-        <w:gridCol w:w="2070"/>
-        <w:gridCol w:w="1965"/>
-        <w:gridCol w:w="2805"/>
-        <w:gridCol w:w="2610"/>
+        <w:gridCol w:w="2600"/>
+        <w:gridCol w:w="1800"/>
+        <w:gridCol w:w="2340"/>
+        <w:gridCol w:w="2710"/>
       </w:tblGrid>
       <w:tr>
         <w:trPr>
@@ -3046,7 +3265,7 @@
         </w:trPr>
         <w:tc>
           <w:tcPr>
-            <w:tcW w:w="2070" w:type="dxa"/>
+            <w:tcW w:w="2600" w:type="dxa"/>
             <w:shd w:val="clear" w:color="auto" w:fill="FFF2CC"/>
             <w:tcMar>
               <w:top w:w="140" w:type="dxa"/>
@@ -3076,7 +3295,7 @@
         </w:tc>
         <w:tc>
           <w:tcPr>
-            <w:tcW w:w="1965" w:type="dxa"/>
+            <w:tcW w:w="1800" w:type="dxa"/>
             <w:shd w:val="clear" w:color="auto" w:fill="FFF2CC"/>
             <w:tcMar>
               <w:top w:w="140" w:type="dxa"/>
@@ -3106,7 +3325,7 @@
         </w:tc>
         <w:tc>
           <w:tcPr>
-            <w:tcW w:w="2805" w:type="dxa"/>
+            <w:tcW w:w="2340" w:type="dxa"/>
             <w:shd w:val="clear" w:color="auto" w:fill="FFF2CC"/>
             <w:tcMar>
               <w:top w:w="140" w:type="dxa"/>
@@ -3136,7 +3355,7 @@
         </w:tc>
         <w:tc>
           <w:tcPr>
-            <w:tcW w:w="2610" w:type="dxa"/>
+            <w:tcW w:w="2710" w:type="dxa"/>
             <w:shd w:val="clear" w:color="auto" w:fill="FFF2CC"/>
             <w:tcMar>
               <w:top w:w="140" w:type="dxa"/>
@@ -3168,7 +3387,7 @@
       <w:tr>
         <w:tc>
           <w:tcPr>
-            <w:tcW w:w="2070" w:type="dxa"/>
+            <w:tcW w:w="2600" w:type="dxa"/>
             <w:shd w:val="clear" w:color="auto" w:fill="FFF2CC"/>
             <w:tcMar>
               <w:top w:w="100" w:type="dxa"/>
@@ -3182,12 +3401,78 @@
               <w:widowControl w:val="0"/>
               <w:spacing w:line="240" w:lineRule="auto"/>
               <w:ind w:left="0"/>
-            </w:pPr>
+              <w:rPr>
+                <w:rFonts w:asciiTheme="majorHAnsi" w:hAnsiTheme="majorHAnsi" w:cstheme="majorHAnsi"/>
+              </w:rPr>
+            </w:pPr>
+            <w:r>
+              <w:rPr>
+                <w:rFonts w:asciiTheme="majorHAnsi" w:hAnsiTheme="majorHAnsi" w:cstheme="majorHAnsi"/>
+              </w:rPr>
+              <w:t>Library with 1 shelf, 3 slots:</w:t>
+            </w:r>
+            <w:r>
+              <w:rPr>
+                <w:rFonts w:asciiTheme="majorHAnsi" w:hAnsiTheme="majorHAnsi" w:cstheme="majorHAnsi"/>
+              </w:rPr>
+              <w:br/>
+            </w:r>
+            <w:r>
+              <w:rPr>
+                <w:rFonts w:asciiTheme="majorHAnsi" w:hAnsiTheme="majorHAnsi" w:cstheme="majorHAnsi"/>
+              </w:rPr>
+              <w:br/>
+              <w:t xml:space="preserve">{ </w:t>
+            </w:r>
+            <w:proofErr w:type="spellStart"/>
+            <w:r>
+              <w:rPr>
+                <w:rFonts w:asciiTheme="majorHAnsi" w:hAnsiTheme="majorHAnsi" w:cstheme="majorHAnsi"/>
+              </w:rPr>
+              <w:t>intoTheWild</w:t>
+            </w:r>
+            <w:proofErr w:type="spellEnd"/>
+            <w:r>
+              <w:rPr>
+                <w:rFonts w:asciiTheme="majorHAnsi" w:hAnsiTheme="majorHAnsi" w:cstheme="majorHAnsi"/>
+              </w:rPr>
+              <w:t xml:space="preserve">, </w:t>
+            </w:r>
+            <w:proofErr w:type="spellStart"/>
+            <w:r>
+              <w:rPr>
+                <w:rFonts w:asciiTheme="majorHAnsi" w:hAnsiTheme="majorHAnsi" w:cstheme="majorHAnsi"/>
+              </w:rPr>
+              <w:t>empireOfTheDamned</w:t>
+            </w:r>
+            <w:proofErr w:type="spellEnd"/>
+            <w:r>
+              <w:rPr>
+                <w:rFonts w:asciiTheme="majorHAnsi" w:hAnsiTheme="majorHAnsi" w:cstheme="majorHAnsi"/>
+              </w:rPr>
+              <w:t xml:space="preserve">, </w:t>
+            </w:r>
+            <w:proofErr w:type="spellStart"/>
+            <w:proofErr w:type="gramStart"/>
+            <w:r>
+              <w:rPr>
+                <w:rFonts w:asciiTheme="majorHAnsi" w:hAnsiTheme="majorHAnsi" w:cstheme="majorHAnsi"/>
+              </w:rPr>
+              <w:t>empireOfTheDawn</w:t>
+            </w:r>
+            <w:proofErr w:type="spellEnd"/>
+            <w:r>
+              <w:rPr>
+                <w:rFonts w:asciiTheme="majorHAnsi" w:hAnsiTheme="majorHAnsi" w:cstheme="majorHAnsi"/>
+              </w:rPr>
+              <w:t xml:space="preserve"> }</w:t>
+            </w:r>
+            <w:proofErr w:type="gramEnd"/>
           </w:p>
         </w:tc>
         <w:tc>
           <w:tcPr>
-            <w:tcW w:w="1965" w:type="dxa"/>
+            <w:tcW w:w="1800" w:type="dxa"/>
             <w:shd w:val="clear" w:color="auto" w:fill="FFF2CC"/>
             <w:tcMar>
               <w:top w:w="100" w:type="dxa"/>
@@ -3201,12 +3486,37 @@
               <w:widowControl w:val="0"/>
               <w:spacing w:line="240" w:lineRule="auto"/>
               <w:ind w:left="0"/>
-            </w:pPr>
+              <w:rPr>
+                <w:rFonts w:asciiTheme="majorHAnsi" w:hAnsiTheme="majorHAnsi" w:cstheme="majorHAnsi"/>
+              </w:rPr>
+            </w:pPr>
+            <w:proofErr w:type="spellStart"/>
+            <w:proofErr w:type="gramStart"/>
+            <w:r>
+              <w:rPr>
+                <w:rFonts w:asciiTheme="majorHAnsi" w:hAnsiTheme="majorHAnsi" w:cstheme="majorHAnsi"/>
+              </w:rPr>
+              <w:t>printAllBooks</w:t>
+            </w:r>
+            <w:proofErr w:type="spellEnd"/>
+            <w:r>
+              <w:rPr>
+                <w:rFonts w:asciiTheme="majorHAnsi" w:hAnsiTheme="majorHAnsi" w:cstheme="majorHAnsi"/>
+              </w:rPr>
+              <w:t>(</w:t>
+            </w:r>
+            <w:proofErr w:type="gramEnd"/>
+            <w:r>
+              <w:rPr>
+                <w:rFonts w:asciiTheme="majorHAnsi" w:hAnsiTheme="majorHAnsi" w:cstheme="majorHAnsi"/>
+              </w:rPr>
+              <w:t>)</w:t>
+            </w:r>
           </w:p>
         </w:tc>
         <w:tc>
           <w:tcPr>
-            <w:tcW w:w="2805" w:type="dxa"/>
+            <w:tcW w:w="2340" w:type="dxa"/>
             <w:shd w:val="clear" w:color="auto" w:fill="FFF2CC"/>
             <w:tcMar>
               <w:top w:w="100" w:type="dxa"/>
@@ -3220,12 +3530,58 @@
               <w:widowControl w:val="0"/>
               <w:spacing w:line="240" w:lineRule="auto"/>
               <w:ind w:left="0"/>
-            </w:pPr>
+              <w:rPr>
+                <w:rFonts w:asciiTheme="majorHAnsi" w:hAnsiTheme="majorHAnsi" w:cstheme="majorHAnsi"/>
+              </w:rPr>
+            </w:pPr>
+            <w:r>
+              <w:rPr>
+                <w:rFonts w:asciiTheme="majorHAnsi" w:hAnsiTheme="majorHAnsi" w:cstheme="majorHAnsi"/>
+              </w:rPr>
+              <w:t xml:space="preserve">“Shelf #1 Slot #1 Title: Into </w:t>
+            </w:r>
+            <w:proofErr w:type="gramStart"/>
+            <w:r>
+              <w:rPr>
+                <w:rFonts w:asciiTheme="majorHAnsi" w:hAnsiTheme="majorHAnsi" w:cstheme="majorHAnsi"/>
+              </w:rPr>
+              <w:t>The</w:t>
+            </w:r>
+            <w:proofErr w:type="gramEnd"/>
+            <w:r>
+              <w:rPr>
+                <w:rFonts w:asciiTheme="majorHAnsi" w:hAnsiTheme="majorHAnsi" w:cstheme="majorHAnsi"/>
+              </w:rPr>
+              <w:t xml:space="preserve"> Wild Author: John Krakauer Year: 1996</w:t>
+            </w:r>
+            <w:r>
+              <w:rPr>
+                <w:rFonts w:asciiTheme="majorHAnsi" w:hAnsiTheme="majorHAnsi" w:cstheme="majorHAnsi"/>
+              </w:rPr>
+              <w:br/>
+              <w:t>Shelf #1 Slot #2 Title: Empire of the Damned Author: Jay Kristoff Year: 2025</w:t>
+            </w:r>
+          </w:p>
+          <w:p>
+            <w:pPr>
+              <w:widowControl w:val="0"/>
+              <w:spacing w:line="240" w:lineRule="auto"/>
+              <w:ind w:left="0"/>
+              <w:rPr>
+                <w:rFonts w:asciiTheme="majorHAnsi" w:hAnsiTheme="majorHAnsi" w:cstheme="majorHAnsi"/>
+              </w:rPr>
+            </w:pPr>
+            <w:r>
+              <w:rPr>
+                <w:rFonts w:asciiTheme="majorHAnsi" w:hAnsiTheme="majorHAnsi" w:cstheme="majorHAnsi"/>
+              </w:rPr>
+              <w:t>Shelf #1 Slot #3 Title: Empire of the Dawn Author: Jay Kristoff Year: 2025</w:t>
+            </w:r>
           </w:p>
         </w:tc>
         <w:tc>
           <w:tcPr>
-            <w:tcW w:w="2610" w:type="dxa"/>
+            <w:tcW w:w="2710" w:type="dxa"/>
             <w:shd w:val="clear" w:color="auto" w:fill="FFF2CC"/>
             <w:tcMar>
               <w:top w:w="100" w:type="dxa"/>
@@ -3239,6 +3595,9 @@
               <w:widowControl w:val="0"/>
               <w:spacing w:line="240" w:lineRule="auto"/>
               <w:ind w:left="0"/>
+              <w:rPr>
+                <w:rFonts w:asciiTheme="majorHAnsi" w:hAnsiTheme="majorHAnsi" w:cstheme="majorHAnsi"/>
+              </w:rPr>
             </w:pPr>
           </w:p>
         </w:tc>
@@ -3246,7 +3605,7 @@
       <w:tr>
         <w:tc>
           <w:tcPr>
-            <w:tcW w:w="2070" w:type="dxa"/>
+            <w:tcW w:w="2600" w:type="dxa"/>
             <w:shd w:val="clear" w:color="auto" w:fill="FFF2CC"/>
             <w:tcMar>
               <w:top w:w="100" w:type="dxa"/>
@@ -3257,15 +3616,94 @@
           </w:tcPr>
           <w:p>
             <w:pPr>
-              <w:widowControl w:val="0"/>
-              <w:spacing w:line="240" w:lineRule="auto"/>
-              <w:ind w:left="0"/>
-            </w:pPr>
+              <w:pStyle w:val="p1"/>
+              <w:rPr>
+                <w:rStyle w:val="s1"/>
+              </w:rPr>
+            </w:pPr>
+            <w:r>
+              <w:rPr>
+                <w:rStyle w:val="s1"/>
+              </w:rPr>
+              <w:t>Library with 2 shelves, 2 slots:</w:t>
+            </w:r>
+          </w:p>
+          <w:p>
+            <w:pPr>
+              <w:pStyle w:val="p1"/>
+              <w:rPr>
+                <w:rFonts w:asciiTheme="majorHAnsi" w:hAnsiTheme="majorHAnsi" w:cstheme="majorHAnsi"/>
+                <w:sz w:val="22"/>
+                <w:szCs w:val="22"/>
+              </w:rPr>
+            </w:pPr>
+            <w:r>
+              <w:rPr>
+                <w:rStyle w:val="s1"/>
+              </w:rPr>
+              <w:t>{</w:t>
+            </w:r>
+            <w:proofErr w:type="spellStart"/>
+            <w:r>
+              <w:rPr>
+                <w:rStyle w:val="s1"/>
+              </w:rPr>
+              <w:t>intoTheWild</w:t>
+            </w:r>
+            <w:proofErr w:type="spellEnd"/>
+            <w:r>
+              <w:rPr>
+                <w:rStyle w:val="s1"/>
+              </w:rPr>
+              <w:t xml:space="preserve">, </w:t>
+            </w:r>
+            <w:proofErr w:type="spellStart"/>
+            <w:r>
+              <w:rPr>
+                <w:rStyle w:val="s1"/>
+              </w:rPr>
+              <w:t>empireOfTheDamned</w:t>
+            </w:r>
+            <w:proofErr w:type="spellEnd"/>
+            <w:r>
+              <w:rPr>
+                <w:rStyle w:val="s1"/>
+              </w:rPr>
+              <w:t xml:space="preserve">, </w:t>
+            </w:r>
+            <w:proofErr w:type="spellStart"/>
+            <w:r>
+              <w:rPr>
+                <w:rStyle w:val="s1"/>
+              </w:rPr>
+              <w:t>intoTheWild</w:t>
+            </w:r>
+            <w:proofErr w:type="spellEnd"/>
+            <w:r>
+              <w:rPr>
+                <w:rStyle w:val="s1"/>
+              </w:rPr>
+              <w:t xml:space="preserve">, </w:t>
+            </w:r>
+            <w:proofErr w:type="spellStart"/>
+            <w:r>
+              <w:rPr>
+                <w:rStyle w:val="s1"/>
+              </w:rPr>
+              <w:t>empireOfTheDawn</w:t>
+            </w:r>
+            <w:proofErr w:type="spellEnd"/>
+            <w:r>
+              <w:rPr>
+                <w:rStyle w:val="s1"/>
+              </w:rPr>
+              <w:t>}</w:t>
+            </w:r>
           </w:p>
         </w:tc>
         <w:tc>
           <w:tcPr>
-            <w:tcW w:w="1965" w:type="dxa"/>
+            <w:tcW w:w="1800" w:type="dxa"/>
             <w:shd w:val="clear" w:color="auto" w:fill="FFF2CC"/>
             <w:tcMar>
               <w:top w:w="100" w:type="dxa"/>
@@ -3279,12 +3717,37 @@
               <w:widowControl w:val="0"/>
               <w:spacing w:line="240" w:lineRule="auto"/>
               <w:ind w:left="0"/>
-            </w:pPr>
+              <w:rPr>
+                <w:rFonts w:asciiTheme="majorHAnsi" w:hAnsiTheme="majorHAnsi" w:cstheme="majorHAnsi"/>
+              </w:rPr>
+            </w:pPr>
+            <w:proofErr w:type="spellStart"/>
+            <w:proofErr w:type="gramStart"/>
+            <w:r>
+              <w:rPr>
+                <w:rFonts w:asciiTheme="majorHAnsi" w:hAnsiTheme="majorHAnsi" w:cstheme="majorHAnsi"/>
+              </w:rPr>
+              <w:t>printAllBooks</w:t>
+            </w:r>
+            <w:proofErr w:type="spellEnd"/>
+            <w:r>
+              <w:rPr>
+                <w:rFonts w:asciiTheme="majorHAnsi" w:hAnsiTheme="majorHAnsi" w:cstheme="majorHAnsi"/>
+              </w:rPr>
+              <w:t>(</w:t>
+            </w:r>
+            <w:proofErr w:type="gramEnd"/>
+            <w:r>
+              <w:rPr>
+                <w:rFonts w:asciiTheme="majorHAnsi" w:hAnsiTheme="majorHAnsi" w:cstheme="majorHAnsi"/>
+              </w:rPr>
+              <w:t>)</w:t>
+            </w:r>
           </w:p>
         </w:tc>
         <w:tc>
           <w:tcPr>
-            <w:tcW w:w="2805" w:type="dxa"/>
+            <w:tcW w:w="2340" w:type="dxa"/>
             <w:shd w:val="clear" w:color="auto" w:fill="FFF2CC"/>
             <w:tcMar>
               <w:top w:w="100" w:type="dxa"/>
@@ -3298,12 +3761,127 @@
               <w:widowControl w:val="0"/>
               <w:spacing w:line="240" w:lineRule="auto"/>
               <w:ind w:left="0"/>
-            </w:pPr>
+              <w:rPr>
+                <w:rFonts w:asciiTheme="majorHAnsi" w:hAnsiTheme="majorHAnsi" w:cstheme="majorHAnsi"/>
+              </w:rPr>
+            </w:pPr>
+            <w:r>
+              <w:rPr>
+                <w:rFonts w:asciiTheme="majorHAnsi" w:hAnsiTheme="majorHAnsi" w:cstheme="majorHAnsi"/>
+              </w:rPr>
+              <w:t xml:space="preserve">“Shelf #1 Slot #1 Title: Into </w:t>
+            </w:r>
+            <w:proofErr w:type="gramStart"/>
+            <w:r>
+              <w:rPr>
+                <w:rFonts w:asciiTheme="majorHAnsi" w:hAnsiTheme="majorHAnsi" w:cstheme="majorHAnsi"/>
+              </w:rPr>
+              <w:t>The</w:t>
+            </w:r>
+            <w:proofErr w:type="gramEnd"/>
+            <w:r>
+              <w:rPr>
+                <w:rFonts w:asciiTheme="majorHAnsi" w:hAnsiTheme="majorHAnsi" w:cstheme="majorHAnsi"/>
+              </w:rPr>
+              <w:t xml:space="preserve"> Wild Author: John Krakauer Year: 1996</w:t>
+            </w:r>
+            <w:r>
+              <w:rPr>
+                <w:rFonts w:asciiTheme="majorHAnsi" w:hAnsiTheme="majorHAnsi" w:cstheme="majorHAnsi"/>
+              </w:rPr>
+              <w:br/>
+              <w:t>Shelf #1 Slot #2 Title: Empire of the Damned Author: Jay Kristoff Year: 2025</w:t>
+            </w:r>
+          </w:p>
+          <w:p>
+            <w:pPr>
+              <w:widowControl w:val="0"/>
+              <w:spacing w:line="240" w:lineRule="auto"/>
+              <w:ind w:left="0"/>
+              <w:rPr>
+                <w:rFonts w:asciiTheme="majorHAnsi" w:hAnsiTheme="majorHAnsi" w:cstheme="majorHAnsi"/>
+              </w:rPr>
+            </w:pPr>
+            <w:r>
+              <w:rPr>
+                <w:rFonts w:asciiTheme="majorHAnsi" w:hAnsiTheme="majorHAnsi" w:cstheme="majorHAnsi"/>
+              </w:rPr>
+              <w:t>Shelf #</w:t>
+            </w:r>
+            <w:r>
+              <w:rPr>
+                <w:rFonts w:asciiTheme="majorHAnsi" w:hAnsiTheme="majorHAnsi" w:cstheme="majorHAnsi"/>
+              </w:rPr>
+              <w:t>2</w:t>
+            </w:r>
+            <w:r>
+              <w:rPr>
+                <w:rFonts w:asciiTheme="majorHAnsi" w:hAnsiTheme="majorHAnsi" w:cstheme="majorHAnsi"/>
+              </w:rPr>
+              <w:t xml:space="preserve"> Slot #</w:t>
+            </w:r>
+            <w:r>
+              <w:rPr>
+                <w:rFonts w:asciiTheme="majorHAnsi" w:hAnsiTheme="majorHAnsi" w:cstheme="majorHAnsi"/>
+              </w:rPr>
+              <w:t>1</w:t>
+            </w:r>
+            <w:r>
+              <w:rPr>
+                <w:rFonts w:asciiTheme="majorHAnsi" w:hAnsiTheme="majorHAnsi" w:cstheme="majorHAnsi"/>
+              </w:rPr>
+              <w:t xml:space="preserve"> Title: Into </w:t>
+            </w:r>
+            <w:proofErr w:type="gramStart"/>
+            <w:r>
+              <w:rPr>
+                <w:rFonts w:asciiTheme="majorHAnsi" w:hAnsiTheme="majorHAnsi" w:cstheme="majorHAnsi"/>
+              </w:rPr>
+              <w:t>The</w:t>
+            </w:r>
+            <w:proofErr w:type="gramEnd"/>
+            <w:r>
+              <w:rPr>
+                <w:rFonts w:asciiTheme="majorHAnsi" w:hAnsiTheme="majorHAnsi" w:cstheme="majorHAnsi"/>
+              </w:rPr>
+              <w:t xml:space="preserve"> Wild Author: John Krakauer Year: 1996</w:t>
+            </w:r>
+            <w:r>
+              <w:rPr>
+                <w:rFonts w:asciiTheme="majorHAnsi" w:hAnsiTheme="majorHAnsi" w:cstheme="majorHAnsi"/>
+              </w:rPr>
+              <w:br/>
+              <w:t>Shelf #</w:t>
+            </w:r>
+            <w:r>
+              <w:rPr>
+                <w:rFonts w:asciiTheme="majorHAnsi" w:hAnsiTheme="majorHAnsi" w:cstheme="majorHAnsi"/>
+              </w:rPr>
+              <w:t>2</w:t>
+            </w:r>
+            <w:r>
+              <w:rPr>
+                <w:rFonts w:asciiTheme="majorHAnsi" w:hAnsiTheme="majorHAnsi" w:cstheme="majorHAnsi"/>
+              </w:rPr>
+              <w:t xml:space="preserve"> Slot #</w:t>
+            </w:r>
+            <w:r>
+              <w:rPr>
+                <w:rFonts w:asciiTheme="majorHAnsi" w:hAnsiTheme="majorHAnsi" w:cstheme="majorHAnsi"/>
+              </w:rPr>
+              <w:t>2</w:t>
+            </w:r>
+            <w:r>
+              <w:rPr>
+                <w:rFonts w:asciiTheme="majorHAnsi" w:hAnsiTheme="majorHAnsi" w:cstheme="majorHAnsi"/>
+              </w:rPr>
+              <w:t xml:space="preserve"> Title: Empire of the Dawn Author: Jay Kristoff Year: 2025</w:t>
+            </w:r>
           </w:p>
         </w:tc>
         <w:tc>
           <w:tcPr>
-            <w:tcW w:w="2610" w:type="dxa"/>
+            <w:tcW w:w="2710" w:type="dxa"/>
             <w:shd w:val="clear" w:color="auto" w:fill="FFF2CC"/>
             <w:tcMar>
               <w:top w:w="100" w:type="dxa"/>
@@ -3317,6 +3895,9 @@
               <w:widowControl w:val="0"/>
               <w:spacing w:line="240" w:lineRule="auto"/>
               <w:ind w:left="0"/>
+              <w:rPr>
+                <w:rFonts w:asciiTheme="majorHAnsi" w:hAnsiTheme="majorHAnsi" w:cstheme="majorHAnsi"/>
+              </w:rPr>
             </w:pPr>
           </w:p>
         </w:tc>
@@ -3324,7 +3905,7 @@
       <w:tr>
         <w:tc>
           <w:tcPr>
-            <w:tcW w:w="2070" w:type="dxa"/>
+            <w:tcW w:w="2600" w:type="dxa"/>
             <w:shd w:val="clear" w:color="auto" w:fill="FFF2CC"/>
             <w:tcMar>
               <w:top w:w="100" w:type="dxa"/>
@@ -3339,11 +3920,40 @@
               <w:spacing w:line="240" w:lineRule="auto"/>
               <w:ind w:left="0"/>
             </w:pPr>
+            <w:r>
+              <w:t xml:space="preserve">Library with 1 shelf, 4 slots, but </w:t>
+            </w:r>
+            <w:r>
+              <w:t xml:space="preserve">no </w:t>
+            </w:r>
+            <w:r>
+              <w:t>book:</w:t>
+            </w:r>
+          </w:p>
+          <w:p>
+            <w:pPr>
+              <w:widowControl w:val="0"/>
+              <w:spacing w:line="240" w:lineRule="auto"/>
+              <w:ind w:left="0"/>
+            </w:pPr>
+          </w:p>
+          <w:p>
+            <w:pPr>
+              <w:widowControl w:val="0"/>
+              <w:spacing w:line="240" w:lineRule="auto"/>
+              <w:ind w:left="0"/>
+            </w:pPr>
+            <w:r>
+              <w:t>{</w:t>
+            </w:r>
+            <w:r>
+              <w:t xml:space="preserve"> } </w:t>
+            </w:r>
           </w:p>
         </w:tc>
         <w:tc>
           <w:tcPr>
-            <w:tcW w:w="1965" w:type="dxa"/>
+            <w:tcW w:w="1800" w:type="dxa"/>
             <w:shd w:val="clear" w:color="auto" w:fill="FFF2CC"/>
             <w:tcMar>
               <w:top w:w="100" w:type="dxa"/>
@@ -3358,11 +3968,33 @@
               <w:spacing w:line="240" w:lineRule="auto"/>
               <w:ind w:left="0"/>
             </w:pPr>
+            <w:proofErr w:type="spellStart"/>
+            <w:proofErr w:type="gramStart"/>
+            <w:r>
+              <w:rPr>
+                <w:rFonts w:asciiTheme="majorHAnsi" w:hAnsiTheme="majorHAnsi" w:cstheme="majorHAnsi"/>
+              </w:rPr>
+              <w:t>printAllBooks</w:t>
+            </w:r>
+            <w:proofErr w:type="spellEnd"/>
+            <w:r>
+              <w:rPr>
+                <w:rFonts w:asciiTheme="majorHAnsi" w:hAnsiTheme="majorHAnsi" w:cstheme="majorHAnsi"/>
+              </w:rPr>
+              <w:t>(</w:t>
+            </w:r>
+            <w:proofErr w:type="gramEnd"/>
+            <w:r>
+              <w:rPr>
+                <w:rFonts w:asciiTheme="majorHAnsi" w:hAnsiTheme="majorHAnsi" w:cstheme="majorHAnsi"/>
+              </w:rPr>
+              <w:t>)</w:t>
+            </w:r>
           </w:p>
         </w:tc>
         <w:tc>
           <w:tcPr>
-            <w:tcW w:w="2805" w:type="dxa"/>
+            <w:tcW w:w="2340" w:type="dxa"/>
             <w:shd w:val="clear" w:color="auto" w:fill="FFF2CC"/>
             <w:tcMar>
               <w:top w:w="100" w:type="dxa"/>
@@ -3377,11 +4009,23 @@
               <w:spacing w:line="240" w:lineRule="auto"/>
               <w:ind w:left="0"/>
             </w:pPr>
+            <w:r>
+              <w:rPr>
+                <w:rFonts w:asciiTheme="majorHAnsi" w:hAnsiTheme="majorHAnsi" w:cstheme="majorHAnsi"/>
+              </w:rPr>
+              <w:t>“There are currently no books in the library.”</w:t>
+            </w:r>
+            <w:r>
+              <w:rPr>
+                <w:rFonts w:asciiTheme="majorHAnsi" w:hAnsiTheme="majorHAnsi" w:cstheme="majorHAnsi"/>
+              </w:rPr>
+              <w:br/>
+            </w:r>
           </w:p>
         </w:tc>
         <w:tc>
           <w:tcPr>
-            <w:tcW w:w="2610" w:type="dxa"/>
+            <w:tcW w:w="2710" w:type="dxa"/>
             <w:shd w:val="clear" w:color="auto" w:fill="FFF2CC"/>
             <w:tcMar>
               <w:top w:w="100" w:type="dxa"/>
@@ -3407,6 +4051,11 @@
       </w:pPr>
       <w:bookmarkStart w:id="7" w:name="_heading=h.2pfu7bu4o8jq" w:colFirst="0" w:colLast="0"/>
       <w:bookmarkEnd w:id="7"/>
+    </w:p>
+    <w:p>
+      <w:pPr>
+        <w:pStyle w:val="Heading2"/>
+      </w:pPr>
       <w:r>
         <w:t xml:space="preserve">Method </w:t>
       </w:r>
@@ -3467,6 +4116,7 @@
               <w:ind w:left="0"/>
             </w:pPr>
             <w:r>
+              <w:lastRenderedPageBreak/>
               <w:t>Shelf 1 has 0 books</w:t>
             </w:r>
           </w:p>
@@ -3592,6 +4242,9 @@
       <w:r>
         <w:t>User Story:</w:t>
       </w:r>
+      <w:r>
+        <w:t xml:space="preserve"> As a user, I want to see how many books are on each shelf</w:t>
+      </w:r>
     </w:p>
     <w:p>
       <w:r>
@@ -3614,6 +4267,12 @@
         </w:rPr>
         <w:t xml:space="preserve"> </w:t>
       </w:r>
+      <w:r>
+        <w:rPr>
+          <w:shd w:val="clear" w:color="auto" w:fill="FFF2CC"/>
+        </w:rPr>
+        <w:t>Outputs a message displaying the number of books on each shelf</w:t>
+      </w:r>
     </w:p>
     <w:p>
       <w:pPr>
@@ -3630,6 +4289,12 @@
           <w:shd w:val="clear" w:color="auto" w:fill="FFF2CC"/>
         </w:rPr>
         <w:t xml:space="preserve"> </w:t>
+      </w:r>
+      <w:r>
+        <w:rPr>
+          <w:shd w:val="clear" w:color="auto" w:fill="FFF2CC"/>
+        </w:rPr>
+        <w:t>Does not count null slots</w:t>
       </w:r>
     </w:p>
     <w:p>
@@ -3659,10 +4324,10 @@
         <w:tblLook w:val="0600" w:firstRow="0" w:lastRow="0" w:firstColumn="0" w:lastColumn="0" w:noHBand="1" w:noVBand="1"/>
       </w:tblPr>
       <w:tblGrid>
-        <w:gridCol w:w="1920"/>
-        <w:gridCol w:w="2115"/>
-        <w:gridCol w:w="2805"/>
-        <w:gridCol w:w="2610"/>
+        <w:gridCol w:w="2510"/>
+        <w:gridCol w:w="2700"/>
+        <w:gridCol w:w="2430"/>
+        <w:gridCol w:w="1810"/>
       </w:tblGrid>
       <w:tr>
         <w:trPr>
@@ -3670,7 +4335,7 @@
         </w:trPr>
         <w:tc>
           <w:tcPr>
-            <w:tcW w:w="1920" w:type="dxa"/>
+            <w:tcW w:w="2510" w:type="dxa"/>
             <w:shd w:val="clear" w:color="auto" w:fill="FFF2CC"/>
             <w:tcMar>
               <w:top w:w="140" w:type="dxa"/>
@@ -3700,7 +4365,7 @@
         </w:tc>
         <w:tc>
           <w:tcPr>
-            <w:tcW w:w="2115" w:type="dxa"/>
+            <w:tcW w:w="2700" w:type="dxa"/>
             <w:shd w:val="clear" w:color="auto" w:fill="FFF2CC"/>
             <w:tcMar>
               <w:top w:w="140" w:type="dxa"/>
@@ -3730,7 +4395,7 @@
         </w:tc>
         <w:tc>
           <w:tcPr>
-            <w:tcW w:w="2805" w:type="dxa"/>
+            <w:tcW w:w="2430" w:type="dxa"/>
             <w:shd w:val="clear" w:color="auto" w:fill="FFF2CC"/>
             <w:tcMar>
               <w:top w:w="140" w:type="dxa"/>
@@ -3760,7 +4425,7 @@
         </w:tc>
         <w:tc>
           <w:tcPr>
-            <w:tcW w:w="2610" w:type="dxa"/>
+            <w:tcW w:w="1810" w:type="dxa"/>
             <w:shd w:val="clear" w:color="auto" w:fill="FFF2CC"/>
             <w:tcMar>
               <w:top w:w="140" w:type="dxa"/>
@@ -3792,7 +4457,7 @@
       <w:tr>
         <w:tc>
           <w:tcPr>
-            <w:tcW w:w="1920" w:type="dxa"/>
+            <w:tcW w:w="2510" w:type="dxa"/>
             <w:shd w:val="clear" w:color="auto" w:fill="FFF2CC"/>
             <w:tcMar>
               <w:top w:w="100" w:type="dxa"/>
@@ -3807,11 +4472,71 @@
               <w:spacing w:line="240" w:lineRule="auto"/>
               <w:ind w:left="0"/>
             </w:pPr>
+            <w:r>
+              <w:t>Library with 3 shelves, 2 slots:</w:t>
+            </w:r>
+          </w:p>
+          <w:p>
+            <w:pPr>
+              <w:widowControl w:val="0"/>
+              <w:spacing w:line="240" w:lineRule="auto"/>
+              <w:ind w:left="0"/>
+            </w:pPr>
+          </w:p>
+          <w:p>
+            <w:pPr>
+              <w:widowControl w:val="0"/>
+              <w:spacing w:line="240" w:lineRule="auto"/>
+              <w:ind w:left="0"/>
+            </w:pPr>
+            <w:r>
+              <w:t>{</w:t>
+            </w:r>
+            <w:proofErr w:type="spellStart"/>
+            <w:r>
+              <w:t>intoTheWild</w:t>
+            </w:r>
+            <w:proofErr w:type="spellEnd"/>
+            <w:r>
+              <w:t xml:space="preserve">, </w:t>
+            </w:r>
+            <w:proofErr w:type="spellStart"/>
+            <w:r>
+              <w:t>empireOfTheDamned</w:t>
+            </w:r>
+            <w:proofErr w:type="spellEnd"/>
+            <w:r>
+              <w:t xml:space="preserve">, </w:t>
+            </w:r>
+            <w:proofErr w:type="spellStart"/>
+            <w:r>
+              <w:t>empireOfTheDawn</w:t>
+            </w:r>
+            <w:proofErr w:type="spellEnd"/>
+            <w:r>
+              <w:t xml:space="preserve">, </w:t>
+            </w:r>
+            <w:proofErr w:type="spellStart"/>
+            <w:r>
+              <w:t>intoTheWild</w:t>
+            </w:r>
+            <w:proofErr w:type="spellEnd"/>
+            <w:r>
+              <w:t xml:space="preserve">, </w:t>
+            </w:r>
+            <w:proofErr w:type="spellStart"/>
+            <w:r>
+              <w:t>empireOfTheDamned</w:t>
+            </w:r>
+            <w:proofErr w:type="spellEnd"/>
+            <w:r>
+              <w:t xml:space="preserve">} </w:t>
+            </w:r>
           </w:p>
         </w:tc>
         <w:tc>
           <w:tcPr>
-            <w:tcW w:w="2115" w:type="dxa"/>
+            <w:tcW w:w="2700" w:type="dxa"/>
             <w:shd w:val="clear" w:color="auto" w:fill="FFF2CC"/>
             <w:tcMar>
               <w:top w:w="100" w:type="dxa"/>
@@ -3826,11 +4551,24 @@
               <w:spacing w:line="240" w:lineRule="auto"/>
               <w:ind w:left="0"/>
             </w:pPr>
+            <w:proofErr w:type="spellStart"/>
+            <w:proofErr w:type="gramStart"/>
+            <w:r>
+              <w:t>displayCountPerShelf</w:t>
+            </w:r>
+            <w:proofErr w:type="spellEnd"/>
+            <w:r>
+              <w:t>(</w:t>
+            </w:r>
+            <w:proofErr w:type="gramEnd"/>
+            <w:r>
+              <w:t>)</w:t>
+            </w:r>
           </w:p>
         </w:tc>
         <w:tc>
           <w:tcPr>
-            <w:tcW w:w="2805" w:type="dxa"/>
+            <w:tcW w:w="2430" w:type="dxa"/>
             <w:shd w:val="clear" w:color="auto" w:fill="FFF2CC"/>
             <w:tcMar>
               <w:top w:w="100" w:type="dxa"/>
@@ -3845,11 +4583,34 @@
               <w:spacing w:line="240" w:lineRule="auto"/>
               <w:ind w:left="0"/>
             </w:pPr>
+            <w:r>
+              <w:t>Shelf 1 has 3 books.</w:t>
+            </w:r>
+          </w:p>
+          <w:p>
+            <w:pPr>
+              <w:widowControl w:val="0"/>
+              <w:spacing w:line="240" w:lineRule="auto"/>
+              <w:ind w:left="0"/>
+            </w:pPr>
+            <w:r>
+              <w:t>Shelf 2 has 3 books.</w:t>
+            </w:r>
+          </w:p>
+          <w:p>
+            <w:pPr>
+              <w:widowControl w:val="0"/>
+              <w:spacing w:line="240" w:lineRule="auto"/>
+              <w:ind w:left="0"/>
+            </w:pPr>
+            <w:r>
+              <w:t>Shelf 3 has 1 book.</w:t>
+            </w:r>
           </w:p>
         </w:tc>
         <w:tc>
           <w:tcPr>
-            <w:tcW w:w="2610" w:type="dxa"/>
+            <w:tcW w:w="1810" w:type="dxa"/>
             <w:shd w:val="clear" w:color="auto" w:fill="FFF2CC"/>
             <w:tcMar>
               <w:top w:w="100" w:type="dxa"/>
@@ -3870,7 +4631,7 @@
       <w:tr>
         <w:tc>
           <w:tcPr>
-            <w:tcW w:w="1920" w:type="dxa"/>
+            <w:tcW w:w="2510" w:type="dxa"/>
             <w:shd w:val="clear" w:color="auto" w:fill="FFF2CC"/>
             <w:tcMar>
               <w:top w:w="100" w:type="dxa"/>
@@ -3885,11 +4646,55 @@
               <w:spacing w:line="240" w:lineRule="auto"/>
               <w:ind w:left="0"/>
             </w:pPr>
+            <w:r>
+              <w:t>Library with 2 shelves, 3 slots:</w:t>
+            </w:r>
+          </w:p>
+          <w:p>
+            <w:pPr>
+              <w:widowControl w:val="0"/>
+              <w:spacing w:line="240" w:lineRule="auto"/>
+              <w:ind w:left="0"/>
+            </w:pPr>
+          </w:p>
+          <w:p>
+            <w:pPr>
+              <w:widowControl w:val="0"/>
+              <w:spacing w:line="240" w:lineRule="auto"/>
+              <w:ind w:left="0"/>
+            </w:pPr>
+            <w:r>
+              <w:t>{</w:t>
+            </w:r>
+            <w:proofErr w:type="spellStart"/>
+            <w:r>
+              <w:t>intoTheWild</w:t>
+            </w:r>
+            <w:proofErr w:type="spellEnd"/>
+            <w:r>
+              <w:t xml:space="preserve">, </w:t>
+            </w:r>
+            <w:proofErr w:type="spellStart"/>
+            <w:r>
+              <w:t>empireOfTheDamned</w:t>
+            </w:r>
+            <w:proofErr w:type="spellEnd"/>
+            <w:r>
+              <w:t xml:space="preserve">, </w:t>
+            </w:r>
+            <w:proofErr w:type="spellStart"/>
+            <w:r>
+              <w:t>empireOfTheDawn</w:t>
+            </w:r>
+            <w:proofErr w:type="spellEnd"/>
+            <w:r>
+              <w:t>}</w:t>
+            </w:r>
           </w:p>
         </w:tc>
         <w:tc>
           <w:tcPr>
-            <w:tcW w:w="2115" w:type="dxa"/>
+            <w:tcW w:w="2700" w:type="dxa"/>
             <w:shd w:val="clear" w:color="auto" w:fill="FFF2CC"/>
             <w:tcMar>
               <w:top w:w="100" w:type="dxa"/>
@@ -3904,11 +4709,24 @@
               <w:spacing w:line="240" w:lineRule="auto"/>
               <w:ind w:left="0"/>
             </w:pPr>
+            <w:proofErr w:type="spellStart"/>
+            <w:proofErr w:type="gramStart"/>
+            <w:r>
+              <w:t>displayCountPerShelf</w:t>
+            </w:r>
+            <w:proofErr w:type="spellEnd"/>
+            <w:r>
+              <w:t>(</w:t>
+            </w:r>
+            <w:proofErr w:type="gramEnd"/>
+            <w:r>
+              <w:t>)</w:t>
+            </w:r>
           </w:p>
         </w:tc>
         <w:tc>
           <w:tcPr>
-            <w:tcW w:w="2805" w:type="dxa"/>
+            <w:tcW w:w="2430" w:type="dxa"/>
             <w:shd w:val="clear" w:color="auto" w:fill="FFF2CC"/>
             <w:tcMar>
               <w:top w:w="100" w:type="dxa"/>
@@ -3923,11 +4741,24 @@
               <w:spacing w:line="240" w:lineRule="auto"/>
               <w:ind w:left="0"/>
             </w:pPr>
+            <w:r>
+              <w:t>Shelf 1 has 3 books.</w:t>
+            </w:r>
+          </w:p>
+          <w:p>
+            <w:pPr>
+              <w:widowControl w:val="0"/>
+              <w:spacing w:line="240" w:lineRule="auto"/>
+              <w:ind w:left="0"/>
+            </w:pPr>
+            <w:r>
+              <w:t>Shelf 2 has 0 books.</w:t>
+            </w:r>
           </w:p>
         </w:tc>
         <w:tc>
           <w:tcPr>
-            <w:tcW w:w="2610" w:type="dxa"/>
+            <w:tcW w:w="1810" w:type="dxa"/>
             <w:shd w:val="clear" w:color="auto" w:fill="FFF2CC"/>
             <w:tcMar>
               <w:top w:w="100" w:type="dxa"/>
@@ -3948,7 +4779,7 @@
       <w:tr>
         <w:tc>
           <w:tcPr>
-            <w:tcW w:w="1920" w:type="dxa"/>
+            <w:tcW w:w="2510" w:type="dxa"/>
             <w:shd w:val="clear" w:color="auto" w:fill="FFF2CC"/>
             <w:tcMar>
               <w:top w:w="100" w:type="dxa"/>
@@ -3963,11 +4794,39 @@
               <w:spacing w:line="240" w:lineRule="auto"/>
               <w:ind w:left="0"/>
             </w:pPr>
+            <w:r>
+              <w:t>Library with 1 row, 5 slots, but only 1 book</w:t>
+            </w:r>
+          </w:p>
+          <w:p>
+            <w:pPr>
+              <w:widowControl w:val="0"/>
+              <w:spacing w:line="240" w:lineRule="auto"/>
+              <w:ind w:left="0"/>
+            </w:pPr>
+          </w:p>
+          <w:p>
+            <w:pPr>
+              <w:widowControl w:val="0"/>
+              <w:spacing w:line="240" w:lineRule="auto"/>
+              <w:ind w:left="0"/>
+            </w:pPr>
+            <w:r>
+              <w:t>{</w:t>
+            </w:r>
+            <w:proofErr w:type="spellStart"/>
+            <w:r>
+              <w:t>intoTheWild</w:t>
+            </w:r>
+            <w:proofErr w:type="spellEnd"/>
+            <w:r>
+              <w:t>}</w:t>
+            </w:r>
           </w:p>
         </w:tc>
         <w:tc>
           <w:tcPr>
-            <w:tcW w:w="2115" w:type="dxa"/>
+            <w:tcW w:w="2700" w:type="dxa"/>
             <w:shd w:val="clear" w:color="auto" w:fill="FFF2CC"/>
             <w:tcMar>
               <w:top w:w="100" w:type="dxa"/>
@@ -3982,11 +4841,24 @@
               <w:spacing w:line="240" w:lineRule="auto"/>
               <w:ind w:left="0"/>
             </w:pPr>
+            <w:proofErr w:type="spellStart"/>
+            <w:proofErr w:type="gramStart"/>
+            <w:r>
+              <w:t>displayCountPerShelf</w:t>
+            </w:r>
+            <w:proofErr w:type="spellEnd"/>
+            <w:r>
+              <w:t>(</w:t>
+            </w:r>
+            <w:proofErr w:type="gramEnd"/>
+            <w:r>
+              <w:t>)</w:t>
+            </w:r>
           </w:p>
         </w:tc>
         <w:tc>
           <w:tcPr>
-            <w:tcW w:w="2805" w:type="dxa"/>
+            <w:tcW w:w="2430" w:type="dxa"/>
             <w:shd w:val="clear" w:color="auto" w:fill="FFF2CC"/>
             <w:tcMar>
               <w:top w:w="100" w:type="dxa"/>
@@ -4001,11 +4873,14 @@
               <w:spacing w:line="240" w:lineRule="auto"/>
               <w:ind w:left="0"/>
             </w:pPr>
+            <w:r>
+              <w:t>Shelf 1 has 1 book.</w:t>
+            </w:r>
           </w:p>
         </w:tc>
         <w:tc>
           <w:tcPr>
-            <w:tcW w:w="2610" w:type="dxa"/>
+            <w:tcW w:w="1810" w:type="dxa"/>
             <w:shd w:val="clear" w:color="auto" w:fill="FFF2CC"/>
             <w:tcMar>
               <w:top w:w="100" w:type="dxa"/>
@@ -4030,6 +4905,16 @@
       </w:pPr>
       <w:bookmarkStart w:id="8" w:name="_heading=h.3czwp09j44s6" w:colFirst="0" w:colLast="0"/>
       <w:bookmarkEnd w:id="8"/>
+    </w:p>
+    <w:p>
+      <w:pPr>
+        <w:pStyle w:val="Heading2"/>
+      </w:pPr>
+    </w:p>
+    <w:p>
+      <w:pPr>
+        <w:pStyle w:val="Heading2"/>
+      </w:pPr>
       <w:r>
         <w:t xml:space="preserve">Method </w:t>
       </w:r>
@@ -4050,6 +4935,9 @@
     <w:p>
       <w:r>
         <w:t>User Story:</w:t>
+      </w:r>
+      <w:r>
+        <w:t xml:space="preserve"> As a user, I want to see the details of the oldest books in the library</w:t>
       </w:r>
     </w:p>
     <w:p>
@@ -4071,8 +4959,13 @@
         <w:rPr>
           <w:shd w:val="clear" w:color="auto" w:fill="FFF2CC"/>
         </w:rPr>
-        <w:lastRenderedPageBreak/>
         <w:t xml:space="preserve"> </w:t>
+      </w:r>
+      <w:r>
+        <w:rPr>
+          <w:shd w:val="clear" w:color="auto" w:fill="FFF2CC"/>
+        </w:rPr>
+        <w:t>Displays book, or books if multiple, that have the lowest year</w:t>
       </w:r>
     </w:p>
     <w:p>
@@ -4090,6 +4983,12 @@
           <w:shd w:val="clear" w:color="auto" w:fill="FFF2CC"/>
         </w:rPr>
         <w:t xml:space="preserve"> </w:t>
+      </w:r>
+      <w:r>
+        <w:rPr>
+          <w:shd w:val="clear" w:color="auto" w:fill="FFF2CC"/>
+        </w:rPr>
+        <w:t>Outputs a message if library is empty</w:t>
       </w:r>
     </w:p>
     <w:p>
@@ -4239,6 +5138,94 @@
                 <w:szCs w:val="20"/>
               </w:rPr>
             </w:pPr>
+            <w:r>
+              <w:rPr>
+                <w:sz w:val="20"/>
+                <w:szCs w:val="20"/>
+              </w:rPr>
+              <w:t>Library with 1 row, 3 slots:</w:t>
+            </w:r>
+          </w:p>
+          <w:p>
+            <w:pPr>
+              <w:widowControl w:val="0"/>
+              <w:spacing w:line="240" w:lineRule="auto"/>
+              <w:ind w:left="0"/>
+              <w:rPr>
+                <w:sz w:val="20"/>
+                <w:szCs w:val="20"/>
+              </w:rPr>
+            </w:pPr>
+          </w:p>
+          <w:p>
+            <w:pPr>
+              <w:widowControl w:val="0"/>
+              <w:spacing w:line="240" w:lineRule="auto"/>
+              <w:ind w:left="0"/>
+              <w:rPr>
+                <w:sz w:val="20"/>
+                <w:szCs w:val="20"/>
+              </w:rPr>
+            </w:pPr>
+            <w:proofErr w:type="gramStart"/>
+            <w:r>
+              <w:rPr>
+                <w:sz w:val="20"/>
+                <w:szCs w:val="20"/>
+              </w:rPr>
+              <w:t xml:space="preserve">{ </w:t>
+            </w:r>
+            <w:proofErr w:type="spellStart"/>
+            <w:r>
+              <w:rPr>
+                <w:sz w:val="20"/>
+                <w:szCs w:val="20"/>
+              </w:rPr>
+              <w:t>intoTheWild</w:t>
+            </w:r>
+            <w:proofErr w:type="spellEnd"/>
+            <w:proofErr w:type="gramEnd"/>
+            <w:r>
+              <w:rPr>
+                <w:sz w:val="20"/>
+                <w:szCs w:val="20"/>
+              </w:rPr>
+              <w:t xml:space="preserve">, </w:t>
+            </w:r>
+            <w:proofErr w:type="spellStart"/>
+            <w:r>
+              <w:rPr>
+                <w:sz w:val="20"/>
+                <w:szCs w:val="20"/>
+              </w:rPr>
+              <w:t>empireOfTheDamned</w:t>
+            </w:r>
+            <w:proofErr w:type="spellEnd"/>
+            <w:r>
+              <w:rPr>
+                <w:sz w:val="20"/>
+                <w:szCs w:val="20"/>
+              </w:rPr>
+              <w:t xml:space="preserve">, </w:t>
+            </w:r>
+            <w:proofErr w:type="spellStart"/>
+            <w:proofErr w:type="gramStart"/>
+            <w:r>
+              <w:rPr>
+                <w:sz w:val="20"/>
+                <w:szCs w:val="20"/>
+              </w:rPr>
+              <w:t>theNotebook</w:t>
+            </w:r>
+            <w:proofErr w:type="spellEnd"/>
+            <w:r>
+              <w:rPr>
+                <w:sz w:val="20"/>
+                <w:szCs w:val="20"/>
+              </w:rPr>
+              <w:t xml:space="preserve"> }</w:t>
+            </w:r>
+            <w:proofErr w:type="gramEnd"/>
           </w:p>
         </w:tc>
         <w:tc>
@@ -4262,6 +5249,31 @@
                 <w:szCs w:val="20"/>
               </w:rPr>
             </w:pPr>
+            <w:proofErr w:type="spellStart"/>
+            <w:proofErr w:type="gramStart"/>
+            <w:r>
+              <w:rPr>
+                <w:sz w:val="20"/>
+                <w:szCs w:val="20"/>
+              </w:rPr>
+              <w:t>displayOldest</w:t>
+            </w:r>
+            <w:proofErr w:type="spellEnd"/>
+            <w:r>
+              <w:rPr>
+                <w:sz w:val="20"/>
+                <w:szCs w:val="20"/>
+              </w:rPr>
+              <w:t>(</w:t>
+            </w:r>
+            <w:proofErr w:type="gramEnd"/>
+            <w:r>
+              <w:rPr>
+                <w:sz w:val="20"/>
+                <w:szCs w:val="20"/>
+              </w:rPr>
+              <w:t>)</w:t>
+            </w:r>
           </w:p>
         </w:tc>
         <w:tc>
@@ -4285,6 +5297,83 @@
                 <w:szCs w:val="20"/>
               </w:rPr>
             </w:pPr>
+            <w:r>
+              <w:rPr>
+                <w:sz w:val="20"/>
+                <w:szCs w:val="20"/>
+              </w:rPr>
+              <w:t>“The oldest books in our library came out in 1996.”</w:t>
+            </w:r>
+          </w:p>
+          <w:p>
+            <w:pPr>
+              <w:widowControl w:val="0"/>
+              <w:spacing w:line="240" w:lineRule="auto"/>
+              <w:ind w:left="0"/>
+              <w:rPr>
+                <w:sz w:val="20"/>
+                <w:szCs w:val="20"/>
+              </w:rPr>
+            </w:pPr>
+            <w:r>
+              <w:rPr>
+                <w:sz w:val="20"/>
+                <w:szCs w:val="20"/>
+              </w:rPr>
+              <w:t>“Oldest books:”</w:t>
+            </w:r>
+          </w:p>
+          <w:p>
+            <w:pPr>
+              <w:widowControl w:val="0"/>
+              <w:spacing w:line="240" w:lineRule="auto"/>
+              <w:ind w:left="0"/>
+              <w:rPr>
+                <w:sz w:val="20"/>
+                <w:szCs w:val="20"/>
+              </w:rPr>
+            </w:pPr>
+            <w:r>
+              <w:rPr>
+                <w:sz w:val="20"/>
+                <w:szCs w:val="20"/>
+              </w:rPr>
+              <w:t xml:space="preserve">“Title: Into </w:t>
+            </w:r>
+            <w:proofErr w:type="gramStart"/>
+            <w:r>
+              <w:rPr>
+                <w:sz w:val="20"/>
+                <w:szCs w:val="20"/>
+              </w:rPr>
+              <w:t>The</w:t>
+            </w:r>
+            <w:proofErr w:type="gramEnd"/>
+            <w:r>
+              <w:rPr>
+                <w:sz w:val="20"/>
+                <w:szCs w:val="20"/>
+              </w:rPr>
+              <w:t xml:space="preserve"> Wild Author: Jon Krakaeur Year: 1996”</w:t>
+            </w:r>
+          </w:p>
+          <w:p>
+            <w:pPr>
+              <w:widowControl w:val="0"/>
+              <w:spacing w:line="240" w:lineRule="auto"/>
+              <w:ind w:left="0"/>
+              <w:rPr>
+                <w:sz w:val="20"/>
+                <w:szCs w:val="20"/>
+              </w:rPr>
+            </w:pPr>
+            <w:r>
+              <w:rPr>
+                <w:sz w:val="20"/>
+                <w:szCs w:val="20"/>
+              </w:rPr>
+              <w:t>“Title: The Notebook Author: Nicholas Sparks Year: 1996”</w:t>
+            </w:r>
           </w:p>
         </w:tc>
         <w:tc>
@@ -4336,6 +5425,74 @@
                 <w:szCs w:val="20"/>
               </w:rPr>
             </w:pPr>
+            <w:r>
+              <w:rPr>
+                <w:sz w:val="20"/>
+                <w:szCs w:val="20"/>
+              </w:rPr>
+              <w:t xml:space="preserve">Library with 1 row, 2 slots: </w:t>
+            </w:r>
+          </w:p>
+          <w:p>
+            <w:pPr>
+              <w:widowControl w:val="0"/>
+              <w:spacing w:line="240" w:lineRule="auto"/>
+              <w:ind w:left="0"/>
+              <w:rPr>
+                <w:sz w:val="20"/>
+                <w:szCs w:val="20"/>
+              </w:rPr>
+            </w:pPr>
+          </w:p>
+          <w:p>
+            <w:pPr>
+              <w:widowControl w:val="0"/>
+              <w:spacing w:line="240" w:lineRule="auto"/>
+              <w:ind w:left="0"/>
+              <w:rPr>
+                <w:sz w:val="20"/>
+                <w:szCs w:val="20"/>
+              </w:rPr>
+            </w:pPr>
+            <w:r>
+              <w:rPr>
+                <w:sz w:val="20"/>
+                <w:szCs w:val="20"/>
+              </w:rPr>
+              <w:t>{</w:t>
+            </w:r>
+            <w:proofErr w:type="spellStart"/>
+            <w:r>
+              <w:rPr>
+                <w:sz w:val="20"/>
+                <w:szCs w:val="20"/>
+              </w:rPr>
+              <w:t>empireOfTheDamned</w:t>
+            </w:r>
+            <w:proofErr w:type="spellEnd"/>
+            <w:r>
+              <w:rPr>
+                <w:sz w:val="20"/>
+                <w:szCs w:val="20"/>
+              </w:rPr>
+              <w:t xml:space="preserve">, </w:t>
+            </w:r>
+            <w:proofErr w:type="spellStart"/>
+            <w:r>
+              <w:rPr>
+                <w:sz w:val="20"/>
+                <w:szCs w:val="20"/>
+              </w:rPr>
+              <w:t>empireOfTheDawn</w:t>
+            </w:r>
+            <w:proofErr w:type="spellEnd"/>
+            <w:r>
+              <w:rPr>
+                <w:sz w:val="20"/>
+                <w:szCs w:val="20"/>
+              </w:rPr>
+              <w:t>}</w:t>
+            </w:r>
           </w:p>
         </w:tc>
         <w:tc>
@@ -4359,6 +5516,31 @@
                 <w:szCs w:val="20"/>
               </w:rPr>
             </w:pPr>
+            <w:proofErr w:type="spellStart"/>
+            <w:proofErr w:type="gramStart"/>
+            <w:r>
+              <w:rPr>
+                <w:sz w:val="20"/>
+                <w:szCs w:val="20"/>
+              </w:rPr>
+              <w:t>displayOldest</w:t>
+            </w:r>
+            <w:proofErr w:type="spellEnd"/>
+            <w:r>
+              <w:rPr>
+                <w:sz w:val="20"/>
+                <w:szCs w:val="20"/>
+              </w:rPr>
+              <w:t>(</w:t>
+            </w:r>
+            <w:proofErr w:type="gramEnd"/>
+            <w:r>
+              <w:rPr>
+                <w:sz w:val="20"/>
+                <w:szCs w:val="20"/>
+              </w:rPr>
+              <w:t>)</w:t>
+            </w:r>
           </w:p>
         </w:tc>
         <w:tc>
@@ -4372,6 +5554,116 @@
               <w:right w:w="100" w:type="dxa"/>
             </w:tcMar>
           </w:tcPr>
+          <w:p>
+            <w:pPr>
+              <w:widowControl w:val="0"/>
+              <w:spacing w:line="240" w:lineRule="auto"/>
+              <w:ind w:left="0"/>
+              <w:rPr>
+                <w:sz w:val="20"/>
+                <w:szCs w:val="20"/>
+              </w:rPr>
+            </w:pPr>
+            <w:r>
+              <w:rPr>
+                <w:sz w:val="20"/>
+                <w:szCs w:val="20"/>
+              </w:rPr>
+              <w:t xml:space="preserve">“The oldest books in our library came out in </w:t>
+            </w:r>
+            <w:r>
+              <w:rPr>
+                <w:sz w:val="20"/>
+                <w:szCs w:val="20"/>
+              </w:rPr>
+              <w:t>2024</w:t>
+            </w:r>
+            <w:r>
+              <w:rPr>
+                <w:sz w:val="20"/>
+                <w:szCs w:val="20"/>
+              </w:rPr>
+              <w:t>.”</w:t>
+            </w:r>
+          </w:p>
+          <w:p>
+            <w:pPr>
+              <w:widowControl w:val="0"/>
+              <w:spacing w:line="240" w:lineRule="auto"/>
+              <w:ind w:left="0"/>
+              <w:rPr>
+                <w:sz w:val="20"/>
+                <w:szCs w:val="20"/>
+              </w:rPr>
+            </w:pPr>
+            <w:r>
+              <w:rPr>
+                <w:sz w:val="20"/>
+                <w:szCs w:val="20"/>
+              </w:rPr>
+              <w:t>“Oldest books:”</w:t>
+            </w:r>
+          </w:p>
+          <w:p>
+            <w:pPr>
+              <w:widowControl w:val="0"/>
+              <w:spacing w:line="240" w:lineRule="auto"/>
+              <w:ind w:left="0"/>
+              <w:rPr>
+                <w:sz w:val="20"/>
+                <w:szCs w:val="20"/>
+              </w:rPr>
+            </w:pPr>
+            <w:r>
+              <w:rPr>
+                <w:sz w:val="20"/>
+                <w:szCs w:val="20"/>
+              </w:rPr>
+              <w:t>“Title:</w:t>
+            </w:r>
+            <w:r>
+              <w:rPr>
+                <w:sz w:val="20"/>
+                <w:szCs w:val="20"/>
+              </w:rPr>
+              <w:t xml:space="preserve"> Empire of the Damned </w:t>
+            </w:r>
+            <w:r>
+              <w:rPr>
+                <w:sz w:val="20"/>
+                <w:szCs w:val="20"/>
+              </w:rPr>
+              <w:t>Author: J</w:t>
+            </w:r>
+            <w:r>
+              <w:rPr>
+                <w:sz w:val="20"/>
+                <w:szCs w:val="20"/>
+              </w:rPr>
+              <w:t>ay Kristoff Y</w:t>
+            </w:r>
+            <w:r>
+              <w:rPr>
+                <w:sz w:val="20"/>
+                <w:szCs w:val="20"/>
+              </w:rPr>
+              <w:t xml:space="preserve">ear: </w:t>
+            </w:r>
+            <w:r>
+              <w:rPr>
+                <w:sz w:val="20"/>
+                <w:szCs w:val="20"/>
+              </w:rPr>
+              <w:t>2024</w:t>
+            </w:r>
+            <w:r>
+              <w:rPr>
+                <w:sz w:val="20"/>
+                <w:szCs w:val="20"/>
+              </w:rPr>
+              <w:t>”</w:t>
+            </w:r>
+          </w:p>
           <w:p>
             <w:pPr>
               <w:widowControl w:val="0"/>
@@ -4430,6 +5722,42 @@
                 <w:szCs w:val="20"/>
               </w:rPr>
             </w:pPr>
+            <w:r>
+              <w:rPr>
+                <w:sz w:val="20"/>
+                <w:szCs w:val="20"/>
+              </w:rPr>
+              <w:t xml:space="preserve">Library with 1 row, 5 slots, 0 books: </w:t>
+            </w:r>
+          </w:p>
+          <w:p>
+            <w:pPr>
+              <w:widowControl w:val="0"/>
+              <w:spacing w:line="240" w:lineRule="auto"/>
+              <w:ind w:left="0"/>
+              <w:rPr>
+                <w:sz w:val="20"/>
+                <w:szCs w:val="20"/>
+              </w:rPr>
+            </w:pPr>
+          </w:p>
+          <w:p>
+            <w:pPr>
+              <w:widowControl w:val="0"/>
+              <w:spacing w:line="240" w:lineRule="auto"/>
+              <w:ind w:left="0"/>
+              <w:rPr>
+                <w:sz w:val="20"/>
+                <w:szCs w:val="20"/>
+              </w:rPr>
+            </w:pPr>
+            <w:r>
+              <w:rPr>
+                <w:sz w:val="20"/>
+                <w:szCs w:val="20"/>
+              </w:rPr>
+              <w:t>{  }</w:t>
+            </w:r>
           </w:p>
         </w:tc>
         <w:tc>
@@ -4453,6 +5781,31 @@
                 <w:szCs w:val="20"/>
               </w:rPr>
             </w:pPr>
+            <w:proofErr w:type="spellStart"/>
+            <w:proofErr w:type="gramStart"/>
+            <w:r>
+              <w:rPr>
+                <w:sz w:val="20"/>
+                <w:szCs w:val="20"/>
+              </w:rPr>
+              <w:t>displayOldest</w:t>
+            </w:r>
+            <w:proofErr w:type="spellEnd"/>
+            <w:r>
+              <w:rPr>
+                <w:sz w:val="20"/>
+                <w:szCs w:val="20"/>
+              </w:rPr>
+              <w:t>(</w:t>
+            </w:r>
+            <w:proofErr w:type="gramEnd"/>
+            <w:r>
+              <w:rPr>
+                <w:sz w:val="20"/>
+                <w:szCs w:val="20"/>
+              </w:rPr>
+              <w:t>)</w:t>
+            </w:r>
           </w:p>
         </w:tc>
         <w:tc>
@@ -4476,6 +5829,13 @@
                 <w:szCs w:val="20"/>
               </w:rPr>
             </w:pPr>
+            <w:r>
+              <w:rPr>
+                <w:sz w:val="20"/>
+                <w:szCs w:val="20"/>
+              </w:rPr>
+              <w:t>“Library is empty.”</w:t>
+            </w:r>
           </w:p>
         </w:tc>
         <w:tc>
@@ -4527,6 +5887,7 @@
         </w:numPr>
       </w:pPr>
       <w:r>
+        <w:lastRenderedPageBreak/>
         <w:t xml:space="preserve">Add a static method in </w:t>
       </w:r>
       <w:proofErr w:type="spellStart"/>
@@ -4623,6 +5984,17 @@
               <w:spacing w:line="240" w:lineRule="auto"/>
               <w:ind w:left="0"/>
             </w:pPr>
+            <w:r>
+              <w:t xml:space="preserve">I found some null-pointer issues that I was not accounting for in my </w:t>
+            </w:r>
+            <w:proofErr w:type="spellStart"/>
+            <w:r>
+              <w:t>displayOldest</w:t>
+            </w:r>
+            <w:proofErr w:type="spellEnd"/>
+            <w:r>
+              <w:t xml:space="preserve"> method</w:t>
+            </w:r>
           </w:p>
           <w:p>
             <w:pPr>
@@ -4630,8 +6002,34 @@
               <w:spacing w:line="240" w:lineRule="auto"/>
               <w:ind w:left="0"/>
             </w:pPr>
-            <w:r>
-              <w:t>1.2 How did writing tests first (or thinking about test cases) change the way you wrote your methods?</w:t>
+          </w:p>
+          <w:p>
+            <w:pPr>
+              <w:pStyle w:val="ListParagraph"/>
+              <w:widowControl w:val="0"/>
+              <w:numPr>
+                <w:ilvl w:val="1"/>
+                <w:numId w:val="11"/>
+              </w:numPr>
+              <w:spacing w:line="240" w:lineRule="auto"/>
+            </w:pPr>
+            <w:r>
+              <w:t>How did writing tests first (or thinking about test cases) change the way you wrote your methods?</w:t>
+            </w:r>
+          </w:p>
+          <w:p>
+            <w:pPr>
+              <w:widowControl w:val="0"/>
+              <w:spacing w:line="240" w:lineRule="auto"/>
+            </w:pPr>
+          </w:p>
+          <w:p>
+            <w:pPr>
+              <w:widowControl w:val="0"/>
+              <w:spacing w:line="240" w:lineRule="auto"/>
+            </w:pPr>
+            <w:r>
+              <w:t>TDD helps me write methods with SRP in mind, focusing on fulfilling one test with each method</w:t>
             </w:r>
           </w:p>
           <w:p>
@@ -4689,6 +6087,21 @@
             <w:r>
               <w:t>2.1 How did using separate classes (Book and Library) make the program easier to understand and manage?</w:t>
             </w:r>
+          </w:p>
+          <w:p>
+            <w:pPr>
+              <w:spacing w:line="240" w:lineRule="auto"/>
+              <w:ind w:left="0"/>
+            </w:pPr>
+          </w:p>
+          <w:p>
+            <w:pPr>
+              <w:spacing w:line="240" w:lineRule="auto"/>
+              <w:ind w:left="0"/>
+            </w:pPr>
+            <w:r>
+              <w:t>Separation of responsibilities makes it easier to keep track of how methods work, and made adjusting methods to match expected outputs easier, as I can edit just one method/class and only affect that method/class</w:t>
+            </w:r>
             <w:r>
               <w:br/>
             </w:r>
@@ -4708,6 +6121,32 @@
               <w:spacing w:line="240" w:lineRule="auto"/>
               <w:ind w:left="0"/>
             </w:pPr>
+          </w:p>
+          <w:p>
+            <w:pPr>
+              <w:widowControl w:val="0"/>
+              <w:spacing w:line="240" w:lineRule="auto"/>
+              <w:ind w:left="0"/>
+            </w:pPr>
+            <w:r>
+              <w:t xml:space="preserve">It would be harder to </w:t>
+            </w:r>
+            <w:proofErr w:type="gramStart"/>
+            <w:r>
+              <w:t>make adjustments</w:t>
+            </w:r>
+            <w:proofErr w:type="gramEnd"/>
+            <w:r>
+              <w:t xml:space="preserve"> based on expected outcomes, as </w:t>
+            </w:r>
+            <w:proofErr w:type="gramStart"/>
+            <w:r>
+              <w:t>all of</w:t>
+            </w:r>
+            <w:proofErr w:type="gramEnd"/>
+            <w:r>
+              <w:t xml:space="preserve"> the code would be in one spot and harder to sort through to find the line you need</w:t>
+            </w:r>
           </w:p>
         </w:tc>
       </w:tr>
@@ -4755,33 +6194,88 @@
               <w:ind w:left="0"/>
             </w:pPr>
             <w:r>
+              <w:t>3.1 What challenges did you face using a 2D array for the shelves?</w:t>
+            </w:r>
+            <w:r>
+              <w:br/>
+            </w:r>
+          </w:p>
+          <w:p>
+            <w:pPr>
+              <w:spacing w:line="240" w:lineRule="auto"/>
+              <w:ind w:left="0"/>
+            </w:pPr>
+            <w:r>
+              <w:t>I don’t recall facing any significant challenges with the 2D array, aside from the extra coding needed to track the extra index</w:t>
+            </w:r>
+          </w:p>
+          <w:p>
+            <w:pPr>
+              <w:spacing w:line="240" w:lineRule="auto"/>
+              <w:ind w:left="0"/>
+            </w:pPr>
+          </w:p>
+          <w:p>
+            <w:pPr>
+              <w:spacing w:line="240" w:lineRule="auto"/>
+              <w:ind w:left="0"/>
+            </w:pPr>
+            <w:r>
+              <w:t>3.2 Explain how debugger helped working with a 2d array and include a screenshot of your 2d array for the bookshelves in memory in your IDE</w:t>
+            </w:r>
+          </w:p>
+          <w:p>
+            <w:pPr>
+              <w:spacing w:line="240" w:lineRule="auto"/>
+              <w:ind w:left="0"/>
+            </w:pPr>
+            <w:r>
               <w:lastRenderedPageBreak/>
-              <w:t>3.1 What challenges did you face using a 2D array for the shelves?</w:t>
-            </w:r>
-            <w:r>
-              <w:br/>
-            </w:r>
-          </w:p>
-          <w:p>
-            <w:pPr>
-              <w:spacing w:line="240" w:lineRule="auto"/>
-              <w:ind w:left="0"/>
-            </w:pPr>
-          </w:p>
-          <w:p>
-            <w:pPr>
-              <w:spacing w:line="240" w:lineRule="auto"/>
-              <w:ind w:left="0"/>
-            </w:pPr>
-            <w:r>
-              <w:t>3.2 Explain how debugger helped working with a 2d array and include a screenshot of your 2d array for the bookshelves in memory in your IDE</w:t>
-            </w:r>
-          </w:p>
-          <w:p>
-            <w:pPr>
-              <w:spacing w:line="240" w:lineRule="auto"/>
-              <w:ind w:left="0"/>
-            </w:pPr>
+              <w:t xml:space="preserve"> The debugger can help with showing how objects are stored in memory, and how those values change as the contents are changed</w:t>
+            </w:r>
+          </w:p>
+          <w:p>
+            <w:pPr>
+              <w:spacing w:line="240" w:lineRule="auto"/>
+              <w:ind w:left="0"/>
+            </w:pPr>
+            <w:r>
+              <w:drawing>
+                <wp:inline distT="0" distB="0" distL="0" distR="0" wp14:anchorId="730B4914" wp14:editId="12FF824C">
+                  <wp:extent cx="4737100" cy="3441700"/>
+                  <wp:effectExtent l="0" t="0" r="0" b="0"/>
+                  <wp:docPr id="1599567730" name="Picture 1"/>
+                  <wp:cNvGraphicFramePr>
+                    <a:graphicFrameLocks xmlns:a="http://schemas.openxmlformats.org/drawingml/2006/main" noChangeAspect="1"/>
+                  </wp:cNvGraphicFramePr>
+                  <a:graphic xmlns:a="http://schemas.openxmlformats.org/drawingml/2006/main">
+                    <a:graphicData uri="http://schemas.openxmlformats.org/drawingml/2006/picture">
+                      <pic:pic xmlns:pic="http://schemas.openxmlformats.org/drawingml/2006/picture">
+                        <pic:nvPicPr>
+                          <pic:cNvPr id="1599567730" name=""/>
+                          <pic:cNvPicPr/>
+                        </pic:nvPicPr>
+                        <pic:blipFill>
+                          <a:blip r:embed="rId20"/>
+                          <a:stretch>
+                            <a:fillRect/>
+                          </a:stretch>
+                        </pic:blipFill>
+                        <pic:spPr>
+                          <a:xfrm>
+                            <a:off x="0" y="0"/>
+                            <a:ext cx="4737100" cy="3441700"/>
+                          </a:xfrm>
+                          <a:prstGeom prst="rect">
+                            <a:avLst/>
+                          </a:prstGeom>
+                        </pic:spPr>
+                      </pic:pic>
+                    </a:graphicData>
+                  </a:graphic>
+                </wp:inline>
+              </w:drawing>
+            </w:r>
           </w:p>
           <w:p>
             <w:pPr>
@@ -4851,6 +6345,21 @@
               <w:ind w:left="0"/>
             </w:pPr>
             <w:r>
+              <w:t>Planning before coding can help save a lot of time having to re-work code to match expectations</w:t>
+            </w:r>
+          </w:p>
+          <w:p>
+            <w:pPr>
+              <w:spacing w:line="240" w:lineRule="auto"/>
+              <w:ind w:left="0"/>
+            </w:pPr>
+          </w:p>
+          <w:p>
+            <w:pPr>
+              <w:spacing w:line="240" w:lineRule="auto"/>
+              <w:ind w:left="0"/>
+            </w:pPr>
+            <w:r>
               <w:t>4.2 Which part of the program was the easiest for you to implement? Why?</w:t>
             </w:r>
             <w:r>
@@ -4863,6 +6372,21 @@
               <w:ind w:left="0"/>
             </w:pPr>
             <w:r>
+              <w:t>I found the counting methods to be the easiest to implement, as it only involves an int variable to keep count, and incrementing it when you come across any non-null spots in the array</w:t>
+            </w:r>
+          </w:p>
+          <w:p>
+            <w:pPr>
+              <w:spacing w:line="240" w:lineRule="auto"/>
+              <w:ind w:left="0"/>
+            </w:pPr>
+          </w:p>
+          <w:p>
+            <w:pPr>
+              <w:spacing w:line="240" w:lineRule="auto"/>
+              <w:ind w:left="0"/>
+            </w:pPr>
+            <w:r>
               <w:t>4.3 Which part was the most challenging? What strategies helped you overcome it?</w:t>
             </w:r>
           </w:p>
@@ -4874,6 +6398,23 @@
           </w:p>
           <w:p>
             <w:pPr>
+              <w:spacing w:line="240" w:lineRule="auto"/>
+              <w:ind w:left="0"/>
+            </w:pPr>
+            <w:r>
+              <w:t xml:space="preserve">The most challenging was working the </w:t>
+            </w:r>
+            <w:proofErr w:type="spellStart"/>
+            <w:r>
+              <w:t>displayOldest</w:t>
+            </w:r>
+            <w:proofErr w:type="spellEnd"/>
+            <w:r>
+              <w:t xml:space="preserve"> method to show all the books. I added another loop through the array to print any books with a year that matches the oldest year individually. Computationally, I don’t know if this was the best way, but it works.</w:t>
+            </w:r>
+          </w:p>
+          <w:p>
+            <w:pPr>
               <w:widowControl w:val="0"/>
               <w:spacing w:line="240" w:lineRule="auto"/>
               <w:ind w:left="0"/>
@@ -4895,6 +6436,29 @@
               <w:spacing w:line="240" w:lineRule="auto"/>
               <w:ind w:left="0"/>
             </w:pPr>
+            <w:r>
+              <w:t xml:space="preserve">The </w:t>
+            </w:r>
+            <w:proofErr w:type="spellStart"/>
+            <w:r>
+              <w:t>addBook</w:t>
+            </w:r>
+            <w:proofErr w:type="spellEnd"/>
+            <w:r>
+              <w:t xml:space="preserve"> method, because I was able to implement it on my own without </w:t>
+            </w:r>
+            <w:r>
+              <w:lastRenderedPageBreak/>
+              <w:t xml:space="preserve">seeing any examples from class, and it’s a pretty </w:t>
+            </w:r>
+            <w:proofErr w:type="spellStart"/>
+            <w:r>
+              <w:t>verbiose</w:t>
+            </w:r>
+            <w:proofErr w:type="spellEnd"/>
+            <w:r>
+              <w:t xml:space="preserve"> method</w:t>
+            </w:r>
           </w:p>
         </w:tc>
       </w:tr>
@@ -6367,7 +7931,6 @@
                 <w:sz w:val="24"/>
                 <w:szCs w:val="24"/>
               </w:rPr>
-              <w:lastRenderedPageBreak/>
               <w:tab/>
             </w:r>
             <w:proofErr w:type="spellStart"/>
@@ -7903,6 +9466,7 @@
                 <w:sz w:val="24"/>
                 <w:szCs w:val="24"/>
               </w:rPr>
+              <w:lastRenderedPageBreak/>
               <w:tab/>
             </w:r>
             <w:proofErr w:type="spellStart"/>
@@ -9183,6 +10747,7 @@
       <w:bookmarkStart w:id="13" w:name="_heading=h.ud6j651qh3tu" w:colFirst="0" w:colLast="0"/>
       <w:bookmarkEnd w:id="13"/>
       <w:r>
+        <w:lastRenderedPageBreak/>
         <w:t>Sample Output</w:t>
       </w:r>
     </w:p>
@@ -9210,7 +10775,6 @@
       <w:proofErr w:type="spellStart"/>
       <w:proofErr w:type="gramStart"/>
       <w:r>
-        <w:lastRenderedPageBreak/>
         <w:t>getAuthor</w:t>
       </w:r>
       <w:proofErr w:type="spellEnd"/>
@@ -9329,6 +10893,7 @@
     </w:p>
     <w:p>
       <w:r>
+        <w:lastRenderedPageBreak/>
         <w:t>Added "Hello World" by Hannah Fry (2018) at shelf 1, slot 2</w:t>
       </w:r>
     </w:p>
@@ -9473,28 +11038,253 @@
     </w:p>
     <w:p>
       <w:r>
+        <w:t>Added "Refactoring" by Martin Fowler (1999) at shelf 2, slot 4</w:t>
+      </w:r>
+    </w:p>
+    <w:p>
+      <w:r>
+        <w:t>Added "The Pragmatic Programmer" by Andrew Hunt &amp; David Thomas (1999) at shelf 3, slot 1</w:t>
+      </w:r>
+    </w:p>
+    <w:p>
+      <w:r>
+        <w:t>Added "Peopleware" by Tom DeMarco &amp; Tim Lister (1987) at shelf 3, slot 2</w:t>
+      </w:r>
+    </w:p>
+    <w:p>
+      <w:r>
+        <w:t>Added "Computer Lib / Dream Machines" by Ted Nelson (1975) at shelf 3, slot 3</w:t>
+      </w:r>
+    </w:p>
+    <w:p/>
+    <w:p>
+      <w:r>
+        <w:t>Shelf 1 has 4 books</w:t>
+      </w:r>
+    </w:p>
+    <w:p>
+      <w:r>
+        <w:t>Shelf 2 has 4 books</w:t>
+      </w:r>
+    </w:p>
+    <w:p>
+      <w:r>
+        <w:t>Shelf 3 has 3 books</w:t>
+      </w:r>
+    </w:p>
+    <w:p/>
+    <w:p>
+      <w:r>
+        <w:t>------------------------------------------------------------</w:t>
+      </w:r>
+    </w:p>
+    <w:p>
+      <w:r>
+        <w:t>All books in Test Library</w:t>
+      </w:r>
+    </w:p>
+    <w:p>
+      <w:r>
+        <w:t>Shelf   Slot   Book Details</w:t>
+      </w:r>
+    </w:p>
+    <w:p>
+      <w:r>
+        <w:t>------------------------------------------------------------</w:t>
+      </w:r>
+    </w:p>
+    <w:p>
+      <w:r>
+        <w:t xml:space="preserve">   1     </w:t>
+      </w:r>
+      <w:proofErr w:type="gramStart"/>
+      <w:r>
+        <w:t>1  "</w:t>
+      </w:r>
+      <w:proofErr w:type="gramEnd"/>
+      <w:r>
+        <w:t>Unmasking AI" by Joy Buolamwini (2023)</w:t>
+      </w:r>
+    </w:p>
+    <w:p>
+      <w:r>
+        <w:t xml:space="preserve">   1     </w:t>
+      </w:r>
+      <w:proofErr w:type="gramStart"/>
+      <w:r>
+        <w:t>2  "</w:t>
+      </w:r>
+      <w:proofErr w:type="gramEnd"/>
+      <w:r>
+        <w:t>Hello World" by Hannah Fry (2018)</w:t>
+      </w:r>
+    </w:p>
+    <w:p>
+      <w:r>
+        <w:t xml:space="preserve">   1     </w:t>
+      </w:r>
+      <w:proofErr w:type="gramStart"/>
+      <w:r>
+        <w:t>3  "</w:t>
+      </w:r>
+      <w:proofErr w:type="gramEnd"/>
+      <w:r>
+        <w:t>Race After Technology" by Ruha Benjamin (2019)</w:t>
+      </w:r>
+    </w:p>
+    <w:p>
+      <w:r>
+        <w:t xml:space="preserve">   1     </w:t>
+      </w:r>
+      <w:proofErr w:type="gramStart"/>
+      <w:r>
+        <w:t>4  "</w:t>
+      </w:r>
+      <w:proofErr w:type="gramEnd"/>
+      <w:r>
+        <w:t>Deep Learning" by Ian Goodfellow (2016)</w:t>
+      </w:r>
+    </w:p>
+    <w:p>
+      <w:r>
         <w:lastRenderedPageBreak/>
-        <w:t>Added "Refactoring" by Martin Fowler (1999) at shelf 2, slot 4</w:t>
-      </w:r>
-    </w:p>
-    <w:p>
-      <w:r>
-        <w:t>Added "The Pragmatic Programmer" by Andrew Hunt &amp; David Thomas (1999) at shelf 3, slot 1</w:t>
-      </w:r>
-    </w:p>
-    <w:p>
-      <w:r>
-        <w:t>Added "Peopleware" by Tom DeMarco &amp; Tim Lister (1987) at shelf 3, slot 2</w:t>
-      </w:r>
-    </w:p>
-    <w:p>
-      <w:r>
-        <w:t>Added "Computer Lib / Dream Machines" by Ted Nelson (1975) at shelf 3, slot 3</w:t>
+        <w:t xml:space="preserve">   2     </w:t>
+      </w:r>
+      <w:proofErr w:type="gramStart"/>
+      <w:r>
+        <w:t>1  "</w:t>
+      </w:r>
+      <w:proofErr w:type="gramEnd"/>
+      <w:r>
+        <w:t>Algorithms to Live By" by Brian Christian (2016)</w:t>
+      </w:r>
+    </w:p>
+    <w:p>
+      <w:r>
+        <w:t xml:space="preserve">   2     </w:t>
+      </w:r>
+      <w:proofErr w:type="gramStart"/>
+      <w:r>
+        <w:t>2  "</w:t>
+      </w:r>
+      <w:proofErr w:type="gramEnd"/>
+      <w:r>
+        <w:t>Weapons of Math Destruction" by Cathy O'Neil (2016)</w:t>
+      </w:r>
+    </w:p>
+    <w:p>
+      <w:r>
+        <w:t xml:space="preserve">   2     </w:t>
+      </w:r>
+      <w:proofErr w:type="gramStart"/>
+      <w:r>
+        <w:t>3  "</w:t>
+      </w:r>
+      <w:proofErr w:type="gramEnd"/>
+      <w:r>
+        <w:t>The Mythical Man-Month" by Fred Brooks (1975)</w:t>
+      </w:r>
+    </w:p>
+    <w:p>
+      <w:r>
+        <w:t xml:space="preserve">   2     </w:t>
+      </w:r>
+      <w:proofErr w:type="gramStart"/>
+      <w:r>
+        <w:t>4  "</w:t>
+      </w:r>
+      <w:proofErr w:type="gramEnd"/>
+      <w:r>
+        <w:t>Refactoring" by Martin Fowler (1999)</w:t>
+      </w:r>
+    </w:p>
+    <w:p>
+      <w:r>
+        <w:t xml:space="preserve">   3     </w:t>
+      </w:r>
+      <w:proofErr w:type="gramStart"/>
+      <w:r>
+        <w:t>1  "</w:t>
+      </w:r>
+      <w:proofErr w:type="gramEnd"/>
+      <w:r>
+        <w:t>The Pragmatic Programmer" by Andrew Hunt &amp; David Thomas (1999)</w:t>
+      </w:r>
+    </w:p>
+    <w:p>
+      <w:r>
+        <w:t xml:space="preserve">   3     </w:t>
+      </w:r>
+      <w:proofErr w:type="gramStart"/>
+      <w:r>
+        <w:t>2  "</w:t>
+      </w:r>
+      <w:proofErr w:type="gramEnd"/>
+      <w:r>
+        <w:t>Peopleware" by Tom DeMarco &amp; Tim Lister (1987)</w:t>
+      </w:r>
+    </w:p>
+    <w:p>
+      <w:r>
+        <w:t xml:space="preserve">   3     </w:t>
+      </w:r>
+      <w:proofErr w:type="gramStart"/>
+      <w:r>
+        <w:t>3  "</w:t>
+      </w:r>
+      <w:proofErr w:type="gramEnd"/>
+      <w:r>
+        <w:t>Computer Lib / Dream Machines" by Ted Nelson (1975)</w:t>
+      </w:r>
+    </w:p>
+    <w:p>
+      <w:r>
+        <w:t>(11 of 12 slots filled)</w:t>
+      </w:r>
+    </w:p>
+    <w:p>
+      <w:r>
+        <w:t>------------------------------------------------------------</w:t>
+      </w:r>
+    </w:p>
+    <w:p>
+      <w:r>
+        <w:t>Oldest books in Test Library</w:t>
+      </w:r>
+    </w:p>
+    <w:p>
+      <w:r>
+        <w:t>Earliest publication year: 1975</w:t>
+      </w:r>
+    </w:p>
+    <w:p>
+      <w:r>
+        <w:t>"The Mythical Man-Month" by Fred Brooks (1975)</w:t>
+      </w:r>
+    </w:p>
+    <w:p>
+      <w:r>
+        <w:t>"Computer Lib / Dream Machines" by Ted Nelson (1975)</w:t>
       </w:r>
     </w:p>
     <w:p/>
     <w:p>
       <w:r>
+        <w:t>Test add more books than capacity...</w:t>
+      </w:r>
+    </w:p>
+    <w:p>
+      <w:r>
+        <w:t>Added "Extra Title" by Extra Author (2024) at shelf 3, slot 4</w:t>
+      </w:r>
+    </w:p>
+    <w:p>
+      <w:pPr>
+        <w:ind w:left="0"/>
+      </w:pPr>
+    </w:p>
+    <w:p>
+      <w:r>
         <w:t>Shelf 1 has 4 books</w:t>
       </w:r>
     </w:p>
@@ -9505,7 +11295,7 @@
     </w:p>
     <w:p>
       <w:r>
-        <w:t>Shelf 3 has 3 books</w:t>
+        <w:t>Shelf 3 has 4 books</w:t>
       </w:r>
     </w:p>
     <w:p/>
@@ -9526,232 +11316,6 @@
     </w:p>
     <w:p>
       <w:r>
-        <w:t>------------------------------------------------------------</w:t>
-      </w:r>
-    </w:p>
-    <w:p>
-      <w:r>
-        <w:t xml:space="preserve">   1     </w:t>
-      </w:r>
-      <w:proofErr w:type="gramStart"/>
-      <w:r>
-        <w:t>1  "</w:t>
-      </w:r>
-      <w:proofErr w:type="gramEnd"/>
-      <w:r>
-        <w:t>Unmasking AI" by Joy Buolamwini (2023)</w:t>
-      </w:r>
-    </w:p>
-    <w:p>
-      <w:r>
-        <w:t xml:space="preserve">   1     </w:t>
-      </w:r>
-      <w:proofErr w:type="gramStart"/>
-      <w:r>
-        <w:t>2  "</w:t>
-      </w:r>
-      <w:proofErr w:type="gramEnd"/>
-      <w:r>
-        <w:t>Hello World" by Hannah Fry (2018)</w:t>
-      </w:r>
-    </w:p>
-    <w:p>
-      <w:r>
-        <w:t xml:space="preserve">   1     </w:t>
-      </w:r>
-      <w:proofErr w:type="gramStart"/>
-      <w:r>
-        <w:t>3  "</w:t>
-      </w:r>
-      <w:proofErr w:type="gramEnd"/>
-      <w:r>
-        <w:t>Race After Technology" by Ruha Benjamin (2019)</w:t>
-      </w:r>
-    </w:p>
-    <w:p>
-      <w:r>
-        <w:t xml:space="preserve">   1     </w:t>
-      </w:r>
-      <w:proofErr w:type="gramStart"/>
-      <w:r>
-        <w:t>4  "</w:t>
-      </w:r>
-      <w:proofErr w:type="gramEnd"/>
-      <w:r>
-        <w:t>Deep Learning" by Ian Goodfellow (2016)</w:t>
-      </w:r>
-    </w:p>
-    <w:p>
-      <w:r>
-        <w:t xml:space="preserve">   2     </w:t>
-      </w:r>
-      <w:proofErr w:type="gramStart"/>
-      <w:r>
-        <w:t>1  "</w:t>
-      </w:r>
-      <w:proofErr w:type="gramEnd"/>
-      <w:r>
-        <w:t>Algorithms to Live By" by Brian Christian (2016)</w:t>
-      </w:r>
-    </w:p>
-    <w:p>
-      <w:r>
-        <w:t xml:space="preserve">   2     </w:t>
-      </w:r>
-      <w:proofErr w:type="gramStart"/>
-      <w:r>
-        <w:t>2  "</w:t>
-      </w:r>
-      <w:proofErr w:type="gramEnd"/>
-      <w:r>
-        <w:t>Weapons of Math Destruction" by Cathy O'Neil (2016)</w:t>
-      </w:r>
-    </w:p>
-    <w:p>
-      <w:r>
-        <w:t xml:space="preserve">   2     </w:t>
-      </w:r>
-      <w:proofErr w:type="gramStart"/>
-      <w:r>
-        <w:t>3  "</w:t>
-      </w:r>
-      <w:proofErr w:type="gramEnd"/>
-      <w:r>
-        <w:t>The Mythical Man-Month" by Fred Brooks (1975)</w:t>
-      </w:r>
-    </w:p>
-    <w:p>
-      <w:r>
-        <w:t xml:space="preserve">   2     </w:t>
-      </w:r>
-      <w:proofErr w:type="gramStart"/>
-      <w:r>
-        <w:t>4  "</w:t>
-      </w:r>
-      <w:proofErr w:type="gramEnd"/>
-      <w:r>
-        <w:t>Refactoring" by Martin Fowler (1999)</w:t>
-      </w:r>
-    </w:p>
-    <w:p>
-      <w:r>
-        <w:t xml:space="preserve">   3     </w:t>
-      </w:r>
-      <w:proofErr w:type="gramStart"/>
-      <w:r>
-        <w:t>1  "</w:t>
-      </w:r>
-      <w:proofErr w:type="gramEnd"/>
-      <w:r>
-        <w:t>The Pragmatic Programmer" by Andrew Hunt &amp; David Thomas (1999)</w:t>
-      </w:r>
-    </w:p>
-    <w:p>
-      <w:r>
-        <w:t xml:space="preserve">   3     </w:t>
-      </w:r>
-      <w:proofErr w:type="gramStart"/>
-      <w:r>
-        <w:t>2  "</w:t>
-      </w:r>
-      <w:proofErr w:type="gramEnd"/>
-      <w:r>
-        <w:t>Peopleware" by Tom DeMarco &amp; Tim Lister (1987)</w:t>
-      </w:r>
-    </w:p>
-    <w:p>
-      <w:r>
-        <w:t xml:space="preserve">   3     </w:t>
-      </w:r>
-      <w:proofErr w:type="gramStart"/>
-      <w:r>
-        <w:t>3  "</w:t>
-      </w:r>
-      <w:proofErr w:type="gramEnd"/>
-      <w:r>
-        <w:t>Computer Lib / Dream Machines" by Ted Nelson (1975)</w:t>
-      </w:r>
-    </w:p>
-    <w:p>
-      <w:r>
-        <w:t>(11 of 12 slots filled)</w:t>
-      </w:r>
-    </w:p>
-    <w:p>
-      <w:r>
-        <w:t>------------------------------------------------------------</w:t>
-      </w:r>
-    </w:p>
-    <w:p>
-      <w:r>
-        <w:t>Oldest books in Test Library</w:t>
-      </w:r>
-    </w:p>
-    <w:p>
-      <w:r>
-        <w:t>Earliest publication year: 1975</w:t>
-      </w:r>
-    </w:p>
-    <w:p>
-      <w:r>
-        <w:t>"The Mythical Man-Month" by Fred Brooks (1975)</w:t>
-      </w:r>
-    </w:p>
-    <w:p>
-      <w:r>
-        <w:t>"Computer Lib / Dream Machines" by Ted Nelson (1975)</w:t>
-      </w:r>
-    </w:p>
-    <w:p/>
-    <w:p>
-      <w:r>
-        <w:t>Test add more books than capacity...</w:t>
-      </w:r>
-    </w:p>
-    <w:p>
-      <w:r>
-        <w:t>Added "Extra Title" by Extra Author (2024) at shelf 3, slot 4</w:t>
-      </w:r>
-    </w:p>
-    <w:p>
-      <w:pPr>
-        <w:ind w:left="0"/>
-      </w:pPr>
-    </w:p>
-    <w:p>
-      <w:r>
-        <w:t>Shelf 1 has 4 books</w:t>
-      </w:r>
-    </w:p>
-    <w:p>
-      <w:r>
-        <w:t>Shelf 2 has 4 books</w:t>
-      </w:r>
-    </w:p>
-    <w:p>
-      <w:r>
-        <w:t>Shelf 3 has 4 books</w:t>
-      </w:r>
-    </w:p>
-    <w:p/>
-    <w:p>
-      <w:r>
-        <w:t>------------------------------------------------------------</w:t>
-      </w:r>
-    </w:p>
-    <w:p>
-      <w:r>
-        <w:t>All books in Test Library</w:t>
-      </w:r>
-    </w:p>
-    <w:p>
-      <w:r>
-        <w:t>Shelf   Slot   Book Details</w:t>
-      </w:r>
-    </w:p>
-    <w:p>
-      <w:r>
-        <w:lastRenderedPageBreak/>
         <w:t>------------------------------------------------------------</w:t>
       </w:r>
     </w:p>
@@ -9944,17 +11508,18 @@
         </w:rPr>
       </w:pPr>
       <w:r>
+        <w:lastRenderedPageBreak/>
         <w:t>"Computer Lib / Dream Machines" by Ted Nelson (1975)</w:t>
       </w:r>
     </w:p>
     <w:p/>
     <w:sectPr>
-      <w:headerReference w:type="even" r:id="rId20"/>
-      <w:headerReference w:type="default" r:id="rId21"/>
-      <w:footerReference w:type="even" r:id="rId22"/>
-      <w:footerReference w:type="default" r:id="rId23"/>
-      <w:headerReference w:type="first" r:id="rId24"/>
-      <w:footerReference w:type="first" r:id="rId25"/>
+      <w:headerReference w:type="even" r:id="rId21"/>
+      <w:headerReference w:type="default" r:id="rId22"/>
+      <w:footerReference w:type="even" r:id="rId23"/>
+      <w:footerReference w:type="default" r:id="rId24"/>
+      <w:headerReference w:type="first" r:id="rId25"/>
+      <w:footerReference w:type="first" r:id="rId26"/>
       <w:pgSz w:w="12240" w:h="15840"/>
       <w:pgMar w:top="720" w:right="1440" w:bottom="720" w:left="1440" w:header="720" w:footer="720" w:gutter="0"/>
       <w:pgNumType w:start="1"/>
@@ -11103,9 +12668,9 @@
   </w:abstractNum>
   <w:abstractNum w:abstractNumId="9" w15:restartNumberingAfterBreak="0">
     <w:nsid w:val="5EF23DB7"/>
-    <w:multiLevelType w:val="hybridMultilevel"/>
-    <w:tmpl w:val="EAD20C7C"/>
-    <w:lvl w:ilvl="0" w:tplc="0409000F">
+    <w:multiLevelType w:val="multilevel"/>
+    <w:tmpl w:val="F806968E"/>
+    <w:lvl w:ilvl="0">
       <w:start w:val="1"/>
       <w:numFmt w:val="decimal"/>
       <w:lvlText w:val="%1."/>
@@ -11117,77 +12682,109 @@
         <w:rFonts w:hint="default"/>
       </w:rPr>
     </w:lvl>
-    <w:lvl w:ilvl="1" w:tplc="04090019" w:tentative="1">
-      <w:start w:val="1"/>
-      <w:numFmt w:val="lowerLetter"/>
-      <w:lvlText w:val="%2."/>
+    <w:lvl w:ilvl="1">
+      <w:start w:val="2"/>
+      <w:numFmt w:val="decimal"/>
+      <w:isLgl/>
+      <w:lvlText w:val="%1.%2"/>
       <w:lvlJc w:val="left"/>
       <w:pPr>
-        <w:ind w:left="1440" w:hanging="360"/>
-      </w:pPr>
+        <w:ind w:left="720" w:hanging="360"/>
+      </w:pPr>
+      <w:rPr>
+        <w:rFonts w:hint="default"/>
+      </w:rPr>
     </w:lvl>
-    <w:lvl w:ilvl="2" w:tplc="0409001B" w:tentative="1">
-      <w:start w:val="1"/>
-      <w:numFmt w:val="lowerRoman"/>
-      <w:lvlText w:val="%3."/>
-      <w:lvlJc w:val="right"/>
-      <w:pPr>
-        <w:ind w:left="2160" w:hanging="180"/>
-      </w:pPr>
-    </w:lvl>
-    <w:lvl w:ilvl="3" w:tplc="0409000F" w:tentative="1">
+    <w:lvl w:ilvl="2">
       <w:start w:val="1"/>
       <w:numFmt w:val="decimal"/>
-      <w:lvlText w:val="%4."/>
+      <w:isLgl/>
+      <w:lvlText w:val="%1.%2.%3"/>
       <w:lvlJc w:val="left"/>
       <w:pPr>
-        <w:ind w:left="2880" w:hanging="360"/>
-      </w:pPr>
+        <w:ind w:left="1080" w:hanging="720"/>
+      </w:pPr>
+      <w:rPr>
+        <w:rFonts w:hint="default"/>
+      </w:rPr>
     </w:lvl>
-    <w:lvl w:ilvl="4" w:tplc="04090019" w:tentative="1">
-      <w:start w:val="1"/>
-      <w:numFmt w:val="lowerLetter"/>
-      <w:lvlText w:val="%5."/>
-      <w:lvlJc w:val="left"/>
-      <w:pPr>
-        <w:ind w:left="3600" w:hanging="360"/>
-      </w:pPr>
-    </w:lvl>
-    <w:lvl w:ilvl="5" w:tplc="0409001B" w:tentative="1">
-      <w:start w:val="1"/>
-      <w:numFmt w:val="lowerRoman"/>
-      <w:lvlText w:val="%6."/>
-      <w:lvlJc w:val="right"/>
-      <w:pPr>
-        <w:ind w:left="4320" w:hanging="180"/>
-      </w:pPr>
-    </w:lvl>
-    <w:lvl w:ilvl="6" w:tplc="0409000F" w:tentative="1">
+    <w:lvl w:ilvl="3">
       <w:start w:val="1"/>
       <w:numFmt w:val="decimal"/>
-      <w:lvlText w:val="%7."/>
+      <w:isLgl/>
+      <w:lvlText w:val="%1.%2.%3.%4"/>
       <w:lvlJc w:val="left"/>
       <w:pPr>
-        <w:ind w:left="5040" w:hanging="360"/>
-      </w:pPr>
+        <w:ind w:left="1440" w:hanging="1080"/>
+      </w:pPr>
+      <w:rPr>
+        <w:rFonts w:hint="default"/>
+      </w:rPr>
     </w:lvl>
-    <w:lvl w:ilvl="7" w:tplc="04090019" w:tentative="1">
+    <w:lvl w:ilvl="4">
       <w:start w:val="1"/>
-      <w:numFmt w:val="lowerLetter"/>
-      <w:lvlText w:val="%8."/>
+      <w:numFmt w:val="decimal"/>
+      <w:isLgl/>
+      <w:lvlText w:val="%1.%2.%3.%4.%5"/>
       <w:lvlJc w:val="left"/>
       <w:pPr>
-        <w:ind w:left="5760" w:hanging="360"/>
-      </w:pPr>
+        <w:ind w:left="1440" w:hanging="1080"/>
+      </w:pPr>
+      <w:rPr>
+        <w:rFonts w:hint="default"/>
+      </w:rPr>
     </w:lvl>
-    <w:lvl w:ilvl="8" w:tplc="0409001B" w:tentative="1">
+    <w:lvl w:ilvl="5">
       <w:start w:val="1"/>
-      <w:numFmt w:val="lowerRoman"/>
-      <w:lvlText w:val="%9."/>
-      <w:lvlJc w:val="right"/>
-      <w:pPr>
-        <w:ind w:left="6480" w:hanging="180"/>
-      </w:pPr>
+      <w:numFmt w:val="decimal"/>
+      <w:isLgl/>
+      <w:lvlText w:val="%1.%2.%3.%4.%5.%6"/>
+      <w:lvlJc w:val="left"/>
+      <w:pPr>
+        <w:ind w:left="1800" w:hanging="1440"/>
+      </w:pPr>
+      <w:rPr>
+        <w:rFonts w:hint="default"/>
+      </w:rPr>
+    </w:lvl>
+    <w:lvl w:ilvl="6">
+      <w:start w:val="1"/>
+      <w:numFmt w:val="decimal"/>
+      <w:isLgl/>
+      <w:lvlText w:val="%1.%2.%3.%4.%5.%6.%7"/>
+      <w:lvlJc w:val="left"/>
+      <w:pPr>
+        <w:ind w:left="1800" w:hanging="1440"/>
+      </w:pPr>
+      <w:rPr>
+        <w:rFonts w:hint="default"/>
+      </w:rPr>
+    </w:lvl>
+    <w:lvl w:ilvl="7">
+      <w:start w:val="1"/>
+      <w:numFmt w:val="decimal"/>
+      <w:isLgl/>
+      <w:lvlText w:val="%1.%2.%3.%4.%5.%6.%7.%8"/>
+      <w:lvlJc w:val="left"/>
+      <w:pPr>
+        <w:ind w:left="2160" w:hanging="1800"/>
+      </w:pPr>
+      <w:rPr>
+        <w:rFonts w:hint="default"/>
+      </w:rPr>
+    </w:lvl>
+    <w:lvl w:ilvl="8">
+      <w:start w:val="1"/>
+      <w:numFmt w:val="decimal"/>
+      <w:isLgl/>
+      <w:lvlText w:val="%1.%2.%3.%4.%5.%6.%7.%8.%9"/>
+      <w:lvlJc w:val="left"/>
+      <w:pPr>
+        <w:ind w:left="2160" w:hanging="1800"/>
+      </w:pPr>
+      <w:rPr>
+        <w:rFonts w:hint="default"/>
+      </w:rPr>
     </w:lvl>
   </w:abstractNum>
   <w:abstractNum w:abstractNumId="10" w15:restartNumberingAfterBreak="0">
@@ -12115,6 +13712,26 @@
       <w:contextualSpacing/>
     </w:pPr>
   </w:style>
+  <w:style w:type="paragraph" w:customStyle="1" w:styleId="p1">
+    <w:name w:val="p1"/>
+    <w:basedOn w:val="Normal"/>
+    <w:rsid w:val="002C5624"/>
+    <w:pPr>
+      <w:spacing w:before="100" w:beforeAutospacing="1" w:after="100" w:afterAutospacing="1" w:line="240" w:lineRule="auto"/>
+      <w:ind w:left="0"/>
+    </w:pPr>
+    <w:rPr>
+      <w:rFonts w:ascii="Times New Roman" w:eastAsia="Times New Roman" w:hAnsi="Times New Roman" w:cs="Times New Roman"/>
+      <w:sz w:val="24"/>
+      <w:szCs w:val="24"/>
+      <w:lang w:val="en-US"/>
+    </w:rPr>
+  </w:style>
+  <w:style w:type="character" w:customStyle="1" w:styleId="s1">
+    <w:name w:val="s1"/>
+    <w:basedOn w:val="DefaultParagraphFont"/>
+    <w:rsid w:val="002C5624"/>
+  </w:style>
 </w:styles>
 </file>
 

</xml_diff>